<commit_message>
Tạo bộ slide bài giảng Tuần 03 cho 9 khối lớp, cập nhật bộ ảnh AI và LBG Tuần 03
</commit_message>
<xml_diff>
--- a/Hệ thống mẫu văn bản/Nguyên đã làm/Lịch báo giảng/Lịch báo giảng - Tuần 03 (THCS).docx
+++ b/Hệ thống mẫu văn bản/Nguyên đã làm/Lịch báo giảng/Lịch báo giảng - Tuần 03 (THCS).docx
@@ -808,6 +808,12 @@
                 <w:szCs w:val="26"/>
               </w:rPr>
             </w:pPr>
+            <w:r>
+              <w:rPr>
+                <w:rFonts w:ascii="Times New Roman" w:hAnsi="Times New Roman"/>
+                <w:sz w:val="26"/>
+              </w:rPr>
+            </w:r>
           </w:p>
         </w:tc>
         <w:tc>
@@ -829,6 +835,12 @@
                 <w:szCs w:val="26"/>
               </w:rPr>
             </w:pPr>
+            <w:r>
+              <w:rPr>
+                <w:rFonts w:ascii="Times New Roman" w:hAnsi="Times New Roman"/>
+                <w:sz w:val="26"/>
+              </w:rPr>
+            </w:r>
           </w:p>
         </w:tc>
         <w:tc>
@@ -850,6 +862,12 @@
                 <w:szCs w:val="26"/>
               </w:rPr>
             </w:pPr>
+            <w:r>
+              <w:rPr>
+                <w:rFonts w:ascii="Times New Roman" w:hAnsi="Times New Roman"/>
+                <w:sz w:val="26"/>
+              </w:rPr>
+            </w:r>
           </w:p>
         </w:tc>
         <w:tc>
@@ -871,6 +889,12 @@
                 <w:szCs w:val="26"/>
               </w:rPr>
             </w:pPr>
+            <w:r>
+              <w:rPr>
+                <w:rFonts w:ascii="Times New Roman" w:hAnsi="Times New Roman"/>
+                <w:sz w:val="26"/>
+              </w:rPr>
+            </w:r>
           </w:p>
         </w:tc>
         <w:tc>
@@ -892,6 +916,12 @@
                 <w:szCs w:val="26"/>
               </w:rPr>
             </w:pPr>
+            <w:r>
+              <w:rPr>
+                <w:rFonts w:ascii="Times New Roman" w:hAnsi="Times New Roman"/>
+                <w:sz w:val="26"/>
+              </w:rPr>
+            </w:r>
           </w:p>
         </w:tc>
       </w:tr>
@@ -969,6 +999,12 @@
                 <w:szCs w:val="26"/>
               </w:rPr>
             </w:pPr>
+            <w:r>
+              <w:rPr>
+                <w:rFonts w:ascii="Times New Roman" w:hAnsi="Times New Roman"/>
+                <w:sz w:val="26"/>
+              </w:rPr>
+            </w:r>
           </w:p>
         </w:tc>
         <w:tc>
@@ -990,6 +1026,12 @@
                 <w:szCs w:val="26"/>
               </w:rPr>
             </w:pPr>
+            <w:r>
+              <w:rPr>
+                <w:rFonts w:ascii="Times New Roman" w:hAnsi="Times New Roman"/>
+                <w:sz w:val="26"/>
+              </w:rPr>
+            </w:r>
           </w:p>
         </w:tc>
         <w:tc>
@@ -1011,6 +1053,12 @@
                 <w:szCs w:val="26"/>
               </w:rPr>
             </w:pPr>
+            <w:r>
+              <w:rPr>
+                <w:rFonts w:ascii="Times New Roman" w:hAnsi="Times New Roman"/>
+                <w:sz w:val="26"/>
+              </w:rPr>
+            </w:r>
           </w:p>
         </w:tc>
         <w:tc>
@@ -1032,6 +1080,12 @@
                 <w:szCs w:val="26"/>
               </w:rPr>
             </w:pPr>
+            <w:r>
+              <w:rPr>
+                <w:rFonts w:ascii="Times New Roman" w:hAnsi="Times New Roman"/>
+                <w:sz w:val="26"/>
+              </w:rPr>
+            </w:r>
           </w:p>
         </w:tc>
         <w:tc>
@@ -1053,6 +1107,12 @@
                 <w:szCs w:val="26"/>
               </w:rPr>
             </w:pPr>
+            <w:r>
+              <w:rPr>
+                <w:rFonts w:ascii="Times New Roman" w:hAnsi="Times New Roman"/>
+                <w:sz w:val="26"/>
+              </w:rPr>
+            </w:r>
           </w:p>
         </w:tc>
       </w:tr>
@@ -1130,6 +1190,12 @@
                 <w:szCs w:val="26"/>
               </w:rPr>
             </w:pPr>
+            <w:r>
+              <w:rPr>
+                <w:rFonts w:ascii="Times New Roman" w:hAnsi="Times New Roman"/>
+                <w:sz w:val="26"/>
+              </w:rPr>
+            </w:r>
           </w:p>
         </w:tc>
         <w:tc>
@@ -1151,6 +1217,12 @@
                 <w:szCs w:val="26"/>
               </w:rPr>
             </w:pPr>
+            <w:r>
+              <w:rPr>
+                <w:rFonts w:ascii="Times New Roman" w:hAnsi="Times New Roman"/>
+                <w:sz w:val="26"/>
+              </w:rPr>
+            </w:r>
           </w:p>
         </w:tc>
         <w:tc>
@@ -1172,6 +1244,12 @@
                 <w:szCs w:val="26"/>
               </w:rPr>
             </w:pPr>
+            <w:r>
+              <w:rPr>
+                <w:rFonts w:ascii="Times New Roman" w:hAnsi="Times New Roman"/>
+                <w:sz w:val="26"/>
+              </w:rPr>
+            </w:r>
           </w:p>
         </w:tc>
         <w:tc>
@@ -1193,6 +1271,12 @@
                 <w:szCs w:val="26"/>
               </w:rPr>
             </w:pPr>
+            <w:r>
+              <w:rPr>
+                <w:rFonts w:ascii="Times New Roman" w:hAnsi="Times New Roman"/>
+                <w:sz w:val="26"/>
+              </w:rPr>
+            </w:r>
           </w:p>
         </w:tc>
         <w:tc>
@@ -1214,6 +1298,12 @@
                 <w:szCs w:val="26"/>
               </w:rPr>
             </w:pPr>
+            <w:r>
+              <w:rPr>
+                <w:rFonts w:ascii="Times New Roman" w:hAnsi="Times New Roman"/>
+                <w:sz w:val="26"/>
+              </w:rPr>
+            </w:r>
           </w:p>
         </w:tc>
       </w:tr>
@@ -1291,6 +1381,13 @@
                 <w:szCs w:val="26"/>
               </w:rPr>
             </w:pPr>
+            <w:r>
+              <w:rPr>
+                <w:rFonts w:ascii="Times New Roman" w:hAnsi="Times New Roman" w:cs="Times New Roman"/>
+                <w:sz w:val="26"/>
+                <w:szCs w:val="26"/>
+              </w:rPr>
+            </w:r>
           </w:p>
         </w:tc>
         <w:tc>
@@ -1312,6 +1409,13 @@
                 <w:szCs w:val="26"/>
               </w:rPr>
             </w:pPr>
+            <w:r>
+              <w:rPr>
+                <w:rFonts w:ascii="Times New Roman" w:hAnsi="Times New Roman" w:cs="Times New Roman"/>
+                <w:sz w:val="26"/>
+                <w:szCs w:val="26"/>
+              </w:rPr>
+            </w:r>
           </w:p>
         </w:tc>
         <w:tc>
@@ -1333,6 +1437,13 @@
                 <w:szCs w:val="26"/>
               </w:rPr>
             </w:pPr>
+            <w:r>
+              <w:rPr>
+                <w:rFonts w:ascii="Times New Roman" w:hAnsi="Times New Roman" w:cs="Times New Roman"/>
+                <w:sz w:val="26"/>
+                <w:szCs w:val="26"/>
+              </w:rPr>
+            </w:r>
           </w:p>
         </w:tc>
         <w:tc>
@@ -1354,6 +1465,13 @@
                 <w:szCs w:val="26"/>
               </w:rPr>
             </w:pPr>
+            <w:r>
+              <w:rPr>
+                <w:rFonts w:ascii="Times New Roman" w:hAnsi="Times New Roman" w:cs="Times New Roman"/>
+                <w:sz w:val="26"/>
+                <w:szCs w:val="26"/>
+              </w:rPr>
+            </w:r>
           </w:p>
         </w:tc>
         <w:tc>
@@ -1375,6 +1493,13 @@
                 <w:szCs w:val="26"/>
               </w:rPr>
             </w:pPr>
+            <w:r>
+              <w:rPr>
+                <w:rFonts w:ascii="Times New Roman" w:hAnsi="Times New Roman" w:cs="Times New Roman"/>
+                <w:sz w:val="26"/>
+                <w:szCs w:val="26"/>
+              </w:rPr>
+            </w:r>
           </w:p>
         </w:tc>
       </w:tr>
@@ -1452,6 +1577,12 @@
                 <w:szCs w:val="26"/>
               </w:rPr>
             </w:pPr>
+            <w:r>
+              <w:rPr>
+                <w:rFonts w:ascii="Times New Roman" w:hAnsi="Times New Roman"/>
+                <w:sz w:val="26"/>
+              </w:rPr>
+            </w:r>
           </w:p>
         </w:tc>
         <w:tc>
@@ -1473,6 +1604,12 @@
                 <w:szCs w:val="26"/>
               </w:rPr>
             </w:pPr>
+            <w:r>
+              <w:rPr>
+                <w:rFonts w:ascii="Times New Roman" w:hAnsi="Times New Roman"/>
+                <w:sz w:val="26"/>
+              </w:rPr>
+            </w:r>
           </w:p>
         </w:tc>
         <w:tc>
@@ -1494,6 +1631,12 @@
                 <w:szCs w:val="26"/>
               </w:rPr>
             </w:pPr>
+            <w:r>
+              <w:rPr>
+                <w:rFonts w:ascii="Times New Roman" w:hAnsi="Times New Roman"/>
+                <w:sz w:val="26"/>
+              </w:rPr>
+            </w:r>
           </w:p>
         </w:tc>
         <w:tc>
@@ -1515,6 +1658,12 @@
                 <w:szCs w:val="26"/>
               </w:rPr>
             </w:pPr>
+            <w:r>
+              <w:rPr>
+                <w:rFonts w:ascii="Times New Roman" w:hAnsi="Times New Roman"/>
+                <w:sz w:val="26"/>
+              </w:rPr>
+            </w:r>
           </w:p>
         </w:tc>
         <w:tc>
@@ -1536,6 +1685,12 @@
                 <w:szCs w:val="26"/>
               </w:rPr>
             </w:pPr>
+            <w:r>
+              <w:rPr>
+                <w:rFonts w:ascii="Times New Roman" w:hAnsi="Times New Roman"/>
+                <w:sz w:val="26"/>
+              </w:rPr>
+            </w:r>
           </w:p>
         </w:tc>
       </w:tr>
@@ -1619,6 +1774,12 @@
                 <w:szCs w:val="26"/>
               </w:rPr>
             </w:pPr>
+            <w:r>
+              <w:rPr>
+                <w:rFonts w:ascii="Times New Roman" w:hAnsi="Times New Roman"/>
+                <w:sz w:val="26"/>
+              </w:rPr>
+            </w:r>
           </w:p>
         </w:tc>
         <w:tc>
@@ -1640,6 +1801,12 @@
                 <w:szCs w:val="26"/>
               </w:rPr>
             </w:pPr>
+            <w:r>
+              <w:rPr>
+                <w:rFonts w:ascii="Times New Roman" w:hAnsi="Times New Roman"/>
+                <w:sz w:val="26"/>
+              </w:rPr>
+            </w:r>
           </w:p>
         </w:tc>
         <w:tc>
@@ -1661,6 +1828,12 @@
                 <w:szCs w:val="26"/>
               </w:rPr>
             </w:pPr>
+            <w:r>
+              <w:rPr>
+                <w:rFonts w:ascii="Times New Roman" w:hAnsi="Times New Roman"/>
+                <w:sz w:val="26"/>
+              </w:rPr>
+            </w:r>
           </w:p>
         </w:tc>
         <w:tc>
@@ -1682,6 +1855,12 @@
                 <w:szCs w:val="26"/>
               </w:rPr>
             </w:pPr>
+            <w:r>
+              <w:rPr>
+                <w:rFonts w:ascii="Times New Roman" w:hAnsi="Times New Roman"/>
+                <w:sz w:val="26"/>
+              </w:rPr>
+            </w:r>
           </w:p>
         </w:tc>
         <w:tc>
@@ -1703,6 +1882,12 @@
                 <w:szCs w:val="26"/>
               </w:rPr>
             </w:pPr>
+            <w:r>
+              <w:rPr>
+                <w:rFonts w:ascii="Times New Roman" w:hAnsi="Times New Roman"/>
+                <w:sz w:val="26"/>
+              </w:rPr>
+            </w:r>
           </w:p>
         </w:tc>
       </w:tr>
@@ -1782,6 +1967,12 @@
                 <w:szCs w:val="26"/>
               </w:rPr>
             </w:pPr>
+            <w:r>
+              <w:rPr>
+                <w:rFonts w:ascii="Times New Roman" w:hAnsi="Times New Roman"/>
+                <w:sz w:val="26"/>
+              </w:rPr>
+            </w:r>
           </w:p>
         </w:tc>
         <w:tc>
@@ -1803,6 +1994,12 @@
                 <w:szCs w:val="26"/>
               </w:rPr>
             </w:pPr>
+            <w:r>
+              <w:rPr>
+                <w:rFonts w:ascii="Times New Roman" w:hAnsi="Times New Roman"/>
+                <w:sz w:val="26"/>
+              </w:rPr>
+            </w:r>
           </w:p>
         </w:tc>
         <w:tc>
@@ -1824,6 +2021,12 @@
                 <w:szCs w:val="26"/>
               </w:rPr>
             </w:pPr>
+            <w:r>
+              <w:rPr>
+                <w:rFonts w:ascii="Times New Roman" w:hAnsi="Times New Roman"/>
+                <w:sz w:val="26"/>
+              </w:rPr>
+            </w:r>
           </w:p>
         </w:tc>
         <w:tc>
@@ -1845,6 +2048,12 @@
                 <w:szCs w:val="26"/>
               </w:rPr>
             </w:pPr>
+            <w:r>
+              <w:rPr>
+                <w:rFonts w:ascii="Times New Roman" w:hAnsi="Times New Roman"/>
+                <w:sz w:val="26"/>
+              </w:rPr>
+            </w:r>
           </w:p>
         </w:tc>
         <w:tc>
@@ -1866,6 +2075,12 @@
                 <w:szCs w:val="26"/>
               </w:rPr>
             </w:pPr>
+            <w:r>
+              <w:rPr>
+                <w:rFonts w:ascii="Times New Roman" w:hAnsi="Times New Roman"/>
+                <w:sz w:val="26"/>
+              </w:rPr>
+            </w:r>
           </w:p>
         </w:tc>
       </w:tr>
@@ -1945,6 +2160,13 @@
                 <w:szCs w:val="26"/>
               </w:rPr>
             </w:pPr>
+            <w:r>
+              <w:rPr>
+                <w:rFonts w:ascii="Times New Roman" w:hAnsi="Times New Roman" w:cs="Times New Roman"/>
+                <w:sz w:val="26"/>
+                <w:szCs w:val="26"/>
+              </w:rPr>
+            </w:r>
           </w:p>
         </w:tc>
         <w:tc>
@@ -1966,6 +2188,13 @@
                 <w:szCs w:val="26"/>
               </w:rPr>
             </w:pPr>
+            <w:r>
+              <w:rPr>
+                <w:rFonts w:ascii="Times New Roman" w:hAnsi="Times New Roman" w:cs="Times New Roman"/>
+                <w:sz w:val="26"/>
+                <w:szCs w:val="26"/>
+              </w:rPr>
+            </w:r>
           </w:p>
         </w:tc>
         <w:tc>
@@ -1987,6 +2216,13 @@
                 <w:szCs w:val="26"/>
               </w:rPr>
             </w:pPr>
+            <w:r>
+              <w:rPr>
+                <w:rFonts w:ascii="Times New Roman" w:hAnsi="Times New Roman" w:cs="Times New Roman"/>
+                <w:sz w:val="26"/>
+                <w:szCs w:val="26"/>
+              </w:rPr>
+            </w:r>
           </w:p>
         </w:tc>
         <w:tc>
@@ -2008,6 +2244,13 @@
                 <w:szCs w:val="26"/>
               </w:rPr>
             </w:pPr>
+            <w:r>
+              <w:rPr>
+                <w:rFonts w:ascii="Times New Roman" w:hAnsi="Times New Roman" w:cs="Times New Roman"/>
+                <w:sz w:val="26"/>
+                <w:szCs w:val="26"/>
+              </w:rPr>
+            </w:r>
           </w:p>
         </w:tc>
         <w:tc>
@@ -2029,6 +2272,13 @@
                 <w:szCs w:val="26"/>
               </w:rPr>
             </w:pPr>
+            <w:r>
+              <w:rPr>
+                <w:rFonts w:ascii="Times New Roman" w:hAnsi="Times New Roman" w:cs="Times New Roman"/>
+                <w:sz w:val="26"/>
+                <w:szCs w:val="26"/>
+              </w:rPr>
+            </w:r>
           </w:p>
         </w:tc>
       </w:tr>
@@ -2108,6 +2358,13 @@
                 <w:szCs w:val="26"/>
               </w:rPr>
             </w:pPr>
+            <w:r>
+              <w:rPr>
+                <w:rFonts w:ascii="Times New Roman" w:hAnsi="Times New Roman" w:cs="Times New Roman"/>
+                <w:sz w:val="26"/>
+                <w:szCs w:val="26"/>
+              </w:rPr>
+            </w:r>
           </w:p>
         </w:tc>
         <w:tc>
@@ -2129,6 +2386,13 @@
                 <w:szCs w:val="26"/>
               </w:rPr>
             </w:pPr>
+            <w:r>
+              <w:rPr>
+                <w:rFonts w:ascii="Times New Roman" w:hAnsi="Times New Roman" w:cs="Times New Roman"/>
+                <w:sz w:val="26"/>
+                <w:szCs w:val="26"/>
+              </w:rPr>
+            </w:r>
           </w:p>
         </w:tc>
         <w:tc>
@@ -2150,6 +2414,13 @@
                 <w:szCs w:val="26"/>
               </w:rPr>
             </w:pPr>
+            <w:r>
+              <w:rPr>
+                <w:rFonts w:ascii="Times New Roman" w:hAnsi="Times New Roman" w:cs="Times New Roman"/>
+                <w:sz w:val="26"/>
+                <w:szCs w:val="26"/>
+              </w:rPr>
+            </w:r>
           </w:p>
         </w:tc>
         <w:tc>
@@ -2171,6 +2442,13 @@
                 <w:szCs w:val="26"/>
               </w:rPr>
             </w:pPr>
+            <w:r>
+              <w:rPr>
+                <w:rFonts w:ascii="Times New Roman" w:hAnsi="Times New Roman" w:cs="Times New Roman"/>
+                <w:sz w:val="26"/>
+                <w:szCs w:val="26"/>
+              </w:rPr>
+            </w:r>
           </w:p>
         </w:tc>
         <w:tc>
@@ -2192,6 +2470,13 @@
                 <w:szCs w:val="26"/>
               </w:rPr>
             </w:pPr>
+            <w:r>
+              <w:rPr>
+                <w:rFonts w:ascii="Times New Roman" w:hAnsi="Times New Roman" w:cs="Times New Roman"/>
+                <w:sz w:val="26"/>
+                <w:szCs w:val="26"/>
+              </w:rPr>
+            </w:r>
           </w:p>
         </w:tc>
       </w:tr>
@@ -2271,6 +2556,12 @@
                 <w:szCs w:val="26"/>
               </w:rPr>
             </w:pPr>
+            <w:r>
+              <w:rPr>
+                <w:rFonts w:ascii="Times New Roman" w:hAnsi="Times New Roman"/>
+                <w:sz w:val="26"/>
+              </w:rPr>
+            </w:r>
           </w:p>
         </w:tc>
         <w:tc>
@@ -2292,6 +2583,12 @@
                 <w:szCs w:val="26"/>
               </w:rPr>
             </w:pPr>
+            <w:r>
+              <w:rPr>
+                <w:rFonts w:ascii="Times New Roman" w:hAnsi="Times New Roman"/>
+                <w:sz w:val="26"/>
+              </w:rPr>
+            </w:r>
           </w:p>
         </w:tc>
         <w:tc>
@@ -2313,6 +2610,12 @@
                 <w:szCs w:val="26"/>
               </w:rPr>
             </w:pPr>
+            <w:r>
+              <w:rPr>
+                <w:rFonts w:ascii="Times New Roman" w:hAnsi="Times New Roman"/>
+                <w:sz w:val="26"/>
+              </w:rPr>
+            </w:r>
           </w:p>
         </w:tc>
         <w:tc>
@@ -2334,6 +2637,12 @@
                 <w:szCs w:val="26"/>
               </w:rPr>
             </w:pPr>
+            <w:r>
+              <w:rPr>
+                <w:rFonts w:ascii="Times New Roman" w:hAnsi="Times New Roman"/>
+                <w:sz w:val="26"/>
+              </w:rPr>
+            </w:r>
           </w:p>
         </w:tc>
         <w:tc>
@@ -2355,6 +2664,12 @@
                 <w:szCs w:val="26"/>
               </w:rPr>
             </w:pPr>
+            <w:r>
+              <w:rPr>
+                <w:rFonts w:ascii="Times New Roman" w:hAnsi="Times New Roman"/>
+                <w:sz w:val="26"/>
+              </w:rPr>
+            </w:r>
           </w:p>
         </w:tc>
       </w:tr>
@@ -2438,6 +2753,12 @@
                 <w:szCs w:val="26"/>
               </w:rPr>
             </w:pPr>
+            <w:r>
+              <w:rPr>
+                <w:rFonts w:ascii="Times New Roman" w:hAnsi="Times New Roman"/>
+                <w:sz w:val="26"/>
+              </w:rPr>
+            </w:r>
           </w:p>
         </w:tc>
         <w:tc>
@@ -2459,6 +2780,12 @@
                 <w:szCs w:val="26"/>
               </w:rPr>
             </w:pPr>
+            <w:r>
+              <w:rPr>
+                <w:rFonts w:ascii="Times New Roman" w:hAnsi="Times New Roman"/>
+                <w:sz w:val="26"/>
+              </w:rPr>
+            </w:r>
           </w:p>
         </w:tc>
         <w:tc>
@@ -2480,6 +2807,12 @@
                 <w:szCs w:val="26"/>
               </w:rPr>
             </w:pPr>
+            <w:r>
+              <w:rPr>
+                <w:rFonts w:ascii="Times New Roman" w:hAnsi="Times New Roman"/>
+                <w:sz w:val="26"/>
+              </w:rPr>
+            </w:r>
           </w:p>
         </w:tc>
         <w:tc>
@@ -2501,6 +2834,12 @@
                 <w:szCs w:val="26"/>
               </w:rPr>
             </w:pPr>
+            <w:r>
+              <w:rPr>
+                <w:rFonts w:ascii="Times New Roman" w:hAnsi="Times New Roman"/>
+                <w:sz w:val="26"/>
+              </w:rPr>
+            </w:r>
           </w:p>
         </w:tc>
         <w:tc>
@@ -2522,6 +2861,12 @@
                 <w:szCs w:val="26"/>
               </w:rPr>
             </w:pPr>
+            <w:r>
+              <w:rPr>
+                <w:rFonts w:ascii="Times New Roman" w:hAnsi="Times New Roman"/>
+                <w:sz w:val="26"/>
+              </w:rPr>
+            </w:r>
           </w:p>
         </w:tc>
       </w:tr>
@@ -2601,6 +2946,13 @@
                 <w:szCs w:val="26"/>
               </w:rPr>
             </w:pPr>
+            <w:r>
+              <w:rPr>
+                <w:rFonts w:ascii="Times New Roman" w:hAnsi="Times New Roman" w:cs="Times New Roman"/>
+                <w:sz w:val="26"/>
+                <w:szCs w:val="26"/>
+              </w:rPr>
+            </w:r>
           </w:p>
         </w:tc>
         <w:tc>
@@ -2622,6 +2974,13 @@
                 <w:szCs w:val="26"/>
               </w:rPr>
             </w:pPr>
+            <w:r>
+              <w:rPr>
+                <w:rFonts w:ascii="Times New Roman" w:hAnsi="Times New Roman" w:cs="Times New Roman"/>
+                <w:sz w:val="26"/>
+                <w:szCs w:val="26"/>
+              </w:rPr>
+            </w:r>
           </w:p>
         </w:tc>
         <w:tc>
@@ -2643,6 +3002,13 @@
                 <w:szCs w:val="26"/>
               </w:rPr>
             </w:pPr>
+            <w:r>
+              <w:rPr>
+                <w:rFonts w:ascii="Times New Roman" w:hAnsi="Times New Roman" w:cs="Times New Roman"/>
+                <w:sz w:val="26"/>
+                <w:szCs w:val="26"/>
+              </w:rPr>
+            </w:r>
           </w:p>
         </w:tc>
         <w:tc>
@@ -2664,6 +3030,13 @@
                 <w:szCs w:val="26"/>
               </w:rPr>
             </w:pPr>
+            <w:r>
+              <w:rPr>
+                <w:rFonts w:ascii="Times New Roman" w:hAnsi="Times New Roman" w:cs="Times New Roman"/>
+                <w:sz w:val="26"/>
+                <w:szCs w:val="26"/>
+              </w:rPr>
+            </w:r>
           </w:p>
         </w:tc>
         <w:tc>
@@ -2685,6 +3058,13 @@
                 <w:szCs w:val="26"/>
               </w:rPr>
             </w:pPr>
+            <w:r>
+              <w:rPr>
+                <w:rFonts w:ascii="Times New Roman" w:hAnsi="Times New Roman" w:cs="Times New Roman"/>
+                <w:sz w:val="26"/>
+                <w:szCs w:val="26"/>
+              </w:rPr>
+            </w:r>
           </w:p>
         </w:tc>
       </w:tr>
@@ -2764,6 +3144,12 @@
                 <w:szCs w:val="26"/>
               </w:rPr>
             </w:pPr>
+            <w:r>
+              <w:rPr>
+                <w:rFonts w:ascii="Times New Roman" w:hAnsi="Times New Roman"/>
+                <w:sz w:val="26"/>
+              </w:rPr>
+            </w:r>
           </w:p>
         </w:tc>
         <w:tc>
@@ -2785,6 +3171,12 @@
                 <w:szCs w:val="26"/>
               </w:rPr>
             </w:pPr>
+            <w:r>
+              <w:rPr>
+                <w:rFonts w:ascii="Times New Roman" w:hAnsi="Times New Roman"/>
+                <w:sz w:val="26"/>
+              </w:rPr>
+            </w:r>
           </w:p>
         </w:tc>
         <w:tc>
@@ -2806,6 +3198,12 @@
                 <w:szCs w:val="26"/>
               </w:rPr>
             </w:pPr>
+            <w:r>
+              <w:rPr>
+                <w:rFonts w:ascii="Times New Roman" w:hAnsi="Times New Roman"/>
+                <w:sz w:val="26"/>
+              </w:rPr>
+            </w:r>
           </w:p>
         </w:tc>
         <w:tc>
@@ -2827,6 +3225,12 @@
                 <w:szCs w:val="26"/>
               </w:rPr>
             </w:pPr>
+            <w:r>
+              <w:rPr>
+                <w:rFonts w:ascii="Times New Roman" w:hAnsi="Times New Roman"/>
+                <w:sz w:val="26"/>
+              </w:rPr>
+            </w:r>
           </w:p>
         </w:tc>
         <w:tc>
@@ -2848,6 +3252,12 @@
                 <w:szCs w:val="26"/>
               </w:rPr>
             </w:pPr>
+            <w:r>
+              <w:rPr>
+                <w:rFonts w:ascii="Times New Roman" w:hAnsi="Times New Roman"/>
+                <w:sz w:val="26"/>
+              </w:rPr>
+            </w:r>
           </w:p>
         </w:tc>
       </w:tr>
@@ -2927,6 +3337,13 @@
                 <w:szCs w:val="26"/>
               </w:rPr>
             </w:pPr>
+            <w:r>
+              <w:rPr>
+                <w:rFonts w:ascii="Times New Roman" w:hAnsi="Times New Roman" w:cs="Times New Roman"/>
+                <w:sz w:val="26"/>
+                <w:szCs w:val="26"/>
+              </w:rPr>
+            </w:r>
           </w:p>
         </w:tc>
         <w:tc>
@@ -2948,6 +3365,13 @@
                 <w:szCs w:val="26"/>
               </w:rPr>
             </w:pPr>
+            <w:r>
+              <w:rPr>
+                <w:rFonts w:ascii="Times New Roman" w:hAnsi="Times New Roman" w:cs="Times New Roman"/>
+                <w:sz w:val="26"/>
+                <w:szCs w:val="26"/>
+              </w:rPr>
+            </w:r>
           </w:p>
         </w:tc>
         <w:tc>
@@ -2969,6 +3393,13 @@
                 <w:szCs w:val="26"/>
               </w:rPr>
             </w:pPr>
+            <w:r>
+              <w:rPr>
+                <w:rFonts w:ascii="Times New Roman" w:hAnsi="Times New Roman" w:cs="Times New Roman"/>
+                <w:sz w:val="26"/>
+                <w:szCs w:val="26"/>
+              </w:rPr>
+            </w:r>
           </w:p>
         </w:tc>
         <w:tc>
@@ -2990,6 +3421,13 @@
                 <w:szCs w:val="26"/>
               </w:rPr>
             </w:pPr>
+            <w:r>
+              <w:rPr>
+                <w:rFonts w:ascii="Times New Roman" w:hAnsi="Times New Roman" w:cs="Times New Roman"/>
+                <w:sz w:val="26"/>
+                <w:szCs w:val="26"/>
+              </w:rPr>
+            </w:r>
           </w:p>
         </w:tc>
         <w:tc>
@@ -3011,6 +3449,13 @@
                 <w:szCs w:val="26"/>
               </w:rPr>
             </w:pPr>
+            <w:r>
+              <w:rPr>
+                <w:rFonts w:ascii="Times New Roman" w:hAnsi="Times New Roman" w:cs="Times New Roman"/>
+                <w:sz w:val="26"/>
+                <w:szCs w:val="26"/>
+              </w:rPr>
+            </w:r>
           </w:p>
         </w:tc>
       </w:tr>
@@ -3090,6 +3535,12 @@
                 <w:szCs w:val="26"/>
               </w:rPr>
             </w:pPr>
+            <w:r>
+              <w:rPr>
+                <w:rFonts w:ascii="Times New Roman" w:hAnsi="Times New Roman"/>
+                <w:sz w:val="26"/>
+              </w:rPr>
+            </w:r>
           </w:p>
         </w:tc>
         <w:tc>
@@ -3111,6 +3562,12 @@
                 <w:szCs w:val="26"/>
               </w:rPr>
             </w:pPr>
+            <w:r>
+              <w:rPr>
+                <w:rFonts w:ascii="Times New Roman" w:hAnsi="Times New Roman"/>
+                <w:sz w:val="26"/>
+              </w:rPr>
+            </w:r>
           </w:p>
         </w:tc>
         <w:tc>
@@ -3132,6 +3589,12 @@
                 <w:szCs w:val="26"/>
               </w:rPr>
             </w:pPr>
+            <w:r>
+              <w:rPr>
+                <w:rFonts w:ascii="Times New Roman" w:hAnsi="Times New Roman"/>
+                <w:sz w:val="26"/>
+              </w:rPr>
+            </w:r>
           </w:p>
         </w:tc>
         <w:tc>
@@ -3153,6 +3616,12 @@
                 <w:szCs w:val="26"/>
               </w:rPr>
             </w:pPr>
+            <w:r>
+              <w:rPr>
+                <w:rFonts w:ascii="Times New Roman" w:hAnsi="Times New Roman"/>
+                <w:sz w:val="26"/>
+              </w:rPr>
+            </w:r>
           </w:p>
         </w:tc>
         <w:tc>
@@ -3174,6 +3643,12 @@
                 <w:szCs w:val="26"/>
               </w:rPr>
             </w:pPr>
+            <w:r>
+              <w:rPr>
+                <w:rFonts w:ascii="Times New Roman" w:hAnsi="Times New Roman"/>
+                <w:sz w:val="26"/>
+              </w:rPr>
+            </w:r>
           </w:p>
         </w:tc>
       </w:tr>
@@ -3257,6 +3732,13 @@
                 <w:szCs w:val="26"/>
               </w:rPr>
             </w:pPr>
+            <w:r>
+              <w:rPr>
+                <w:rFonts w:ascii="Times New Roman" w:hAnsi="Times New Roman" w:cs="Times New Roman"/>
+                <w:sz w:val="26"/>
+                <w:szCs w:val="26"/>
+              </w:rPr>
+            </w:r>
           </w:p>
         </w:tc>
         <w:tc>
@@ -3278,6 +3760,13 @@
                 <w:szCs w:val="26"/>
               </w:rPr>
             </w:pPr>
+            <w:r>
+              <w:rPr>
+                <w:rFonts w:ascii="Times New Roman" w:hAnsi="Times New Roman" w:cs="Times New Roman"/>
+                <w:sz w:val="26"/>
+                <w:szCs w:val="26"/>
+              </w:rPr>
+            </w:r>
           </w:p>
         </w:tc>
         <w:tc>
@@ -3299,6 +3788,13 @@
                 <w:szCs w:val="26"/>
               </w:rPr>
             </w:pPr>
+            <w:r>
+              <w:rPr>
+                <w:rFonts w:ascii="Times New Roman" w:hAnsi="Times New Roman" w:cs="Times New Roman"/>
+                <w:sz w:val="26"/>
+                <w:szCs w:val="26"/>
+              </w:rPr>
+            </w:r>
           </w:p>
         </w:tc>
         <w:tc>
@@ -3320,6 +3816,13 @@
                 <w:szCs w:val="26"/>
               </w:rPr>
             </w:pPr>
+            <w:r>
+              <w:rPr>
+                <w:rFonts w:ascii="Times New Roman" w:hAnsi="Times New Roman" w:cs="Times New Roman"/>
+                <w:sz w:val="26"/>
+                <w:szCs w:val="26"/>
+              </w:rPr>
+            </w:r>
           </w:p>
         </w:tc>
         <w:tc>
@@ -3341,6 +3844,13 @@
                 <w:szCs w:val="26"/>
               </w:rPr>
             </w:pPr>
+            <w:r>
+              <w:rPr>
+                <w:rFonts w:ascii="Times New Roman" w:hAnsi="Times New Roman" w:cs="Times New Roman"/>
+                <w:sz w:val="26"/>
+                <w:szCs w:val="26"/>
+              </w:rPr>
+            </w:r>
           </w:p>
         </w:tc>
       </w:tr>
@@ -3420,6 +3930,13 @@
                 <w:szCs w:val="26"/>
               </w:rPr>
             </w:pPr>
+            <w:r>
+              <w:rPr>
+                <w:rFonts w:ascii="Times New Roman" w:hAnsi="Times New Roman" w:cs="Times New Roman"/>
+                <w:sz w:val="26"/>
+                <w:szCs w:val="26"/>
+              </w:rPr>
+            </w:r>
           </w:p>
         </w:tc>
         <w:tc>
@@ -3441,6 +3958,13 @@
                 <w:szCs w:val="26"/>
               </w:rPr>
             </w:pPr>
+            <w:r>
+              <w:rPr>
+                <w:rFonts w:ascii="Times New Roman" w:hAnsi="Times New Roman" w:cs="Times New Roman"/>
+                <w:sz w:val="26"/>
+                <w:szCs w:val="26"/>
+              </w:rPr>
+            </w:r>
           </w:p>
         </w:tc>
         <w:tc>
@@ -3462,6 +3986,13 @@
                 <w:szCs w:val="26"/>
               </w:rPr>
             </w:pPr>
+            <w:r>
+              <w:rPr>
+                <w:rFonts w:ascii="Times New Roman" w:hAnsi="Times New Roman" w:cs="Times New Roman"/>
+                <w:sz w:val="26"/>
+                <w:szCs w:val="26"/>
+              </w:rPr>
+            </w:r>
           </w:p>
         </w:tc>
         <w:tc>
@@ -3483,6 +4014,13 @@
                 <w:szCs w:val="26"/>
               </w:rPr>
             </w:pPr>
+            <w:r>
+              <w:rPr>
+                <w:rFonts w:ascii="Times New Roman" w:hAnsi="Times New Roman" w:cs="Times New Roman"/>
+                <w:sz w:val="26"/>
+                <w:szCs w:val="26"/>
+              </w:rPr>
+            </w:r>
           </w:p>
         </w:tc>
         <w:tc>
@@ -3504,6 +4042,13 @@
                 <w:szCs w:val="26"/>
               </w:rPr>
             </w:pPr>
+            <w:r>
+              <w:rPr>
+                <w:rFonts w:ascii="Times New Roman" w:hAnsi="Times New Roman" w:cs="Times New Roman"/>
+                <w:sz w:val="26"/>
+                <w:szCs w:val="26"/>
+              </w:rPr>
+            </w:r>
           </w:p>
         </w:tc>
       </w:tr>
@@ -3583,6 +4128,12 @@
                 <w:szCs w:val="26"/>
               </w:rPr>
             </w:pPr>
+            <w:r>
+              <w:rPr>
+                <w:rFonts w:ascii="Times New Roman" w:hAnsi="Times New Roman"/>
+                <w:sz w:val="26"/>
+              </w:rPr>
+            </w:r>
           </w:p>
         </w:tc>
         <w:tc>
@@ -3604,6 +4155,12 @@
                 <w:szCs w:val="26"/>
               </w:rPr>
             </w:pPr>
+            <w:r>
+              <w:rPr>
+                <w:rFonts w:ascii="Times New Roman" w:hAnsi="Times New Roman"/>
+                <w:sz w:val="26"/>
+              </w:rPr>
+            </w:r>
           </w:p>
         </w:tc>
         <w:tc>
@@ -3625,6 +4182,12 @@
                 <w:szCs w:val="26"/>
               </w:rPr>
             </w:pPr>
+            <w:r>
+              <w:rPr>
+                <w:rFonts w:ascii="Times New Roman" w:hAnsi="Times New Roman"/>
+                <w:sz w:val="26"/>
+              </w:rPr>
+            </w:r>
           </w:p>
         </w:tc>
         <w:tc>
@@ -3646,6 +4209,12 @@
                 <w:szCs w:val="26"/>
               </w:rPr>
             </w:pPr>
+            <w:r>
+              <w:rPr>
+                <w:rFonts w:ascii="Times New Roman" w:hAnsi="Times New Roman"/>
+                <w:sz w:val="26"/>
+              </w:rPr>
+            </w:r>
           </w:p>
         </w:tc>
         <w:tc>
@@ -3667,6 +4236,12 @@
                 <w:szCs w:val="26"/>
               </w:rPr>
             </w:pPr>
+            <w:r>
+              <w:rPr>
+                <w:rFonts w:ascii="Times New Roman" w:hAnsi="Times New Roman"/>
+                <w:sz w:val="26"/>
+              </w:rPr>
+            </w:r>
           </w:p>
         </w:tc>
       </w:tr>
@@ -3746,6 +4321,13 @@
                 <w:szCs w:val="26"/>
               </w:rPr>
             </w:pPr>
+            <w:r>
+              <w:rPr>
+                <w:rFonts w:ascii="Times New Roman" w:hAnsi="Times New Roman" w:cs="Times New Roman"/>
+                <w:sz w:val="26"/>
+                <w:szCs w:val="26"/>
+              </w:rPr>
+            </w:r>
           </w:p>
         </w:tc>
         <w:tc>
@@ -3767,6 +4349,13 @@
                 <w:szCs w:val="26"/>
               </w:rPr>
             </w:pPr>
+            <w:r>
+              <w:rPr>
+                <w:rFonts w:ascii="Times New Roman" w:hAnsi="Times New Roman" w:cs="Times New Roman"/>
+                <w:sz w:val="26"/>
+                <w:szCs w:val="26"/>
+              </w:rPr>
+            </w:r>
           </w:p>
         </w:tc>
         <w:tc>
@@ -3788,6 +4377,13 @@
                 <w:szCs w:val="26"/>
               </w:rPr>
             </w:pPr>
+            <w:r>
+              <w:rPr>
+                <w:rFonts w:ascii="Times New Roman" w:hAnsi="Times New Roman" w:cs="Times New Roman"/>
+                <w:sz w:val="26"/>
+                <w:szCs w:val="26"/>
+              </w:rPr>
+            </w:r>
           </w:p>
         </w:tc>
         <w:tc>
@@ -3809,6 +4405,13 @@
                 <w:szCs w:val="26"/>
               </w:rPr>
             </w:pPr>
+            <w:r>
+              <w:rPr>
+                <w:rFonts w:ascii="Times New Roman" w:hAnsi="Times New Roman" w:cs="Times New Roman"/>
+                <w:sz w:val="26"/>
+                <w:szCs w:val="26"/>
+              </w:rPr>
+            </w:r>
           </w:p>
         </w:tc>
         <w:tc>
@@ -3830,6 +4433,13 @@
                 <w:szCs w:val="26"/>
               </w:rPr>
             </w:pPr>
+            <w:r>
+              <w:rPr>
+                <w:rFonts w:ascii="Times New Roman" w:hAnsi="Times New Roman" w:cs="Times New Roman"/>
+                <w:sz w:val="26"/>
+                <w:szCs w:val="26"/>
+              </w:rPr>
+            </w:r>
           </w:p>
         </w:tc>
       </w:tr>
@@ -3909,6 +4519,12 @@
                 <w:szCs w:val="26"/>
               </w:rPr>
             </w:pPr>
+            <w:r>
+              <w:rPr>
+                <w:rFonts w:ascii="Times New Roman" w:hAnsi="Times New Roman"/>
+                <w:sz w:val="26"/>
+              </w:rPr>
+            </w:r>
           </w:p>
         </w:tc>
         <w:tc>
@@ -3930,6 +4546,12 @@
                 <w:szCs w:val="26"/>
               </w:rPr>
             </w:pPr>
+            <w:r>
+              <w:rPr>
+                <w:rFonts w:ascii="Times New Roman" w:hAnsi="Times New Roman"/>
+                <w:sz w:val="26"/>
+              </w:rPr>
+            </w:r>
           </w:p>
         </w:tc>
         <w:tc>
@@ -3951,6 +4573,12 @@
                 <w:szCs w:val="26"/>
               </w:rPr>
             </w:pPr>
+            <w:r>
+              <w:rPr>
+                <w:rFonts w:ascii="Times New Roman" w:hAnsi="Times New Roman"/>
+                <w:sz w:val="26"/>
+              </w:rPr>
+            </w:r>
           </w:p>
         </w:tc>
         <w:tc>
@@ -3972,6 +4600,12 @@
                 <w:szCs w:val="26"/>
               </w:rPr>
             </w:pPr>
+            <w:r>
+              <w:rPr>
+                <w:rFonts w:ascii="Times New Roman" w:hAnsi="Times New Roman"/>
+                <w:sz w:val="26"/>
+              </w:rPr>
+            </w:r>
           </w:p>
         </w:tc>
         <w:tc>
@@ -3993,6 +4627,12 @@
                 <w:szCs w:val="26"/>
               </w:rPr>
             </w:pPr>
+            <w:r>
+              <w:rPr>
+                <w:rFonts w:ascii="Times New Roman" w:hAnsi="Times New Roman"/>
+                <w:sz w:val="26"/>
+              </w:rPr>
+            </w:r>
           </w:p>
         </w:tc>
       </w:tr>
@@ -4076,6 +4716,12 @@
                 <w:szCs w:val="26"/>
               </w:rPr>
             </w:pPr>
+            <w:r>
+              <w:rPr>
+                <w:rFonts w:ascii="Times New Roman" w:hAnsi="Times New Roman"/>
+                <w:sz w:val="26"/>
+              </w:rPr>
+            </w:r>
           </w:p>
         </w:tc>
         <w:tc>
@@ -4097,6 +4743,12 @@
                 <w:szCs w:val="26"/>
               </w:rPr>
             </w:pPr>
+            <w:r>
+              <w:rPr>
+                <w:rFonts w:ascii="Times New Roman" w:hAnsi="Times New Roman"/>
+                <w:sz w:val="26"/>
+              </w:rPr>
+            </w:r>
           </w:p>
         </w:tc>
         <w:tc>
@@ -4118,6 +4770,12 @@
                 <w:szCs w:val="26"/>
               </w:rPr>
             </w:pPr>
+            <w:r>
+              <w:rPr>
+                <w:rFonts w:ascii="Times New Roman" w:hAnsi="Times New Roman"/>
+                <w:sz w:val="26"/>
+              </w:rPr>
+            </w:r>
           </w:p>
         </w:tc>
         <w:tc>
@@ -4139,6 +4797,12 @@
                 <w:szCs w:val="26"/>
               </w:rPr>
             </w:pPr>
+            <w:r>
+              <w:rPr>
+                <w:rFonts w:ascii="Times New Roman" w:hAnsi="Times New Roman"/>
+                <w:sz w:val="26"/>
+              </w:rPr>
+            </w:r>
           </w:p>
         </w:tc>
         <w:tc>
@@ -4160,6 +4824,12 @@
                 <w:szCs w:val="26"/>
               </w:rPr>
             </w:pPr>
+            <w:r>
+              <w:rPr>
+                <w:rFonts w:ascii="Times New Roman" w:hAnsi="Times New Roman"/>
+                <w:sz w:val="26"/>
+              </w:rPr>
+            </w:r>
           </w:p>
         </w:tc>
       </w:tr>
@@ -4236,6 +4906,13 @@
                 <w:szCs w:val="26"/>
               </w:rPr>
             </w:pPr>
+            <w:r>
+              <w:rPr>
+                <w:rFonts w:ascii="Times New Roman" w:hAnsi="Times New Roman" w:cs="Times New Roman"/>
+                <w:sz w:val="26"/>
+                <w:szCs w:val="26"/>
+              </w:rPr>
+            </w:r>
           </w:p>
         </w:tc>
         <w:tc>
@@ -4257,6 +4934,13 @@
                 <w:szCs w:val="26"/>
               </w:rPr>
             </w:pPr>
+            <w:r>
+              <w:rPr>
+                <w:rFonts w:ascii="Times New Roman" w:hAnsi="Times New Roman" w:cs="Times New Roman"/>
+                <w:sz w:val="26"/>
+                <w:szCs w:val="26"/>
+              </w:rPr>
+            </w:r>
           </w:p>
         </w:tc>
         <w:tc>
@@ -4278,6 +4962,13 @@
                 <w:szCs w:val="26"/>
               </w:rPr>
             </w:pPr>
+            <w:r>
+              <w:rPr>
+                <w:rFonts w:ascii="Times New Roman" w:hAnsi="Times New Roman" w:cs="Times New Roman"/>
+                <w:sz w:val="26"/>
+                <w:szCs w:val="26"/>
+              </w:rPr>
+            </w:r>
           </w:p>
         </w:tc>
         <w:tc>
@@ -4299,6 +4990,13 @@
                 <w:szCs w:val="26"/>
               </w:rPr>
             </w:pPr>
+            <w:r>
+              <w:rPr>
+                <w:rFonts w:ascii="Times New Roman" w:hAnsi="Times New Roman" w:cs="Times New Roman"/>
+                <w:sz w:val="26"/>
+                <w:szCs w:val="26"/>
+              </w:rPr>
+            </w:r>
           </w:p>
         </w:tc>
         <w:tc>
@@ -4320,6 +5018,13 @@
                 <w:szCs w:val="26"/>
               </w:rPr>
             </w:pPr>
+            <w:r>
+              <w:rPr>
+                <w:rFonts w:ascii="Times New Roman" w:hAnsi="Times New Roman" w:cs="Times New Roman"/>
+                <w:sz w:val="26"/>
+                <w:szCs w:val="26"/>
+              </w:rPr>
+            </w:r>
           </w:p>
         </w:tc>
       </w:tr>
@@ -4396,6 +5101,13 @@
                 <w:szCs w:val="26"/>
               </w:rPr>
             </w:pPr>
+            <w:r>
+              <w:rPr>
+                <w:rFonts w:ascii="Times New Roman" w:hAnsi="Times New Roman" w:cs="Times New Roman"/>
+                <w:sz w:val="26"/>
+                <w:szCs w:val="26"/>
+              </w:rPr>
+            </w:r>
           </w:p>
         </w:tc>
         <w:tc>
@@ -4417,6 +5129,13 @@
                 <w:szCs w:val="26"/>
               </w:rPr>
             </w:pPr>
+            <w:r>
+              <w:rPr>
+                <w:rFonts w:ascii="Times New Roman" w:hAnsi="Times New Roman" w:cs="Times New Roman"/>
+                <w:sz w:val="26"/>
+                <w:szCs w:val="26"/>
+              </w:rPr>
+            </w:r>
           </w:p>
         </w:tc>
         <w:tc>
@@ -4438,6 +5157,13 @@
                 <w:szCs w:val="26"/>
               </w:rPr>
             </w:pPr>
+            <w:r>
+              <w:rPr>
+                <w:rFonts w:ascii="Times New Roman" w:hAnsi="Times New Roman" w:cs="Times New Roman"/>
+                <w:sz w:val="26"/>
+                <w:szCs w:val="26"/>
+              </w:rPr>
+            </w:r>
           </w:p>
         </w:tc>
         <w:tc>
@@ -4459,6 +5185,13 @@
                 <w:szCs w:val="26"/>
               </w:rPr>
             </w:pPr>
+            <w:r>
+              <w:rPr>
+                <w:rFonts w:ascii="Times New Roman" w:hAnsi="Times New Roman" w:cs="Times New Roman"/>
+                <w:sz w:val="26"/>
+                <w:szCs w:val="26"/>
+              </w:rPr>
+            </w:r>
           </w:p>
         </w:tc>
         <w:tc>
@@ -4480,6 +5213,13 @@
                 <w:szCs w:val="26"/>
               </w:rPr>
             </w:pPr>
+            <w:r>
+              <w:rPr>
+                <w:rFonts w:ascii="Times New Roman" w:hAnsi="Times New Roman" w:cs="Times New Roman"/>
+                <w:sz w:val="26"/>
+                <w:szCs w:val="26"/>
+              </w:rPr>
+            </w:r>
           </w:p>
         </w:tc>
       </w:tr>
@@ -5024,50 +5764,6 @@
               <w:br/>
             </w:r>
           </w:p>
-          <w:p>
-            <w:pPr>
-              <w:jc w:val="center"/>
-              <w:rPr>
-                <w:rFonts w:ascii="Times New Roman" w:hAnsi="Times New Roman" w:cs="Times New Roman"/>
-                <w:sz w:val="26"/>
-                <w:szCs w:val="26"/>
-              </w:rPr>
-            </w:pPr>
-          </w:p>
-          <w:p>
-            <w:pPr>
-              <w:jc w:val="center"/>
-              <w:rPr>
-                <w:rFonts w:ascii="Times New Roman" w:hAnsi="Times New Roman" w:cs="Times New Roman"/>
-                <w:sz w:val="26"/>
-                <w:szCs w:val="26"/>
-              </w:rPr>
-            </w:pPr>
-            <w:r>
-              <w:rPr>
-                <w:rFonts w:ascii="Times New Roman" w:hAnsi="Times New Roman" w:cs="Times New Roman"/>
-                <w:sz w:val="26"/>
-                <w:szCs w:val="26"/>
-              </w:rPr>
-              <w:t>Nguyễn</w:t>
-            </w:r>
-            <w:r>
-              <w:rPr>
-                <w:rFonts w:ascii="Times New Roman" w:hAnsi="Times New Roman" w:cs="Times New Roman"/>
-                <w:sz w:val="26"/>
-                <w:szCs w:val="26"/>
-              </w:rPr>
-              <w:t xml:space="preserve"> Thị</w:t>
-            </w:r>
-            <w:r>
-              <w:rPr>
-                <w:rFonts w:ascii="Times New Roman" w:hAnsi="Times New Roman" w:cs="Times New Roman"/>
-                <w:sz w:val="26"/>
-                <w:szCs w:val="26"/>
-              </w:rPr>
-              <w:t xml:space="preserve"> Ngọc Ánh</w:t>
-            </w:r>
-          </w:p>
         </w:tc>
       </w:tr>
     </w:tbl>
@@ -5087,7 +5783,6 @@
         <w:rPr>
           <w:i/>
         </w:rPr>
-        <w:lastRenderedPageBreak/>
         <w:t>Buổi…chiều…..Tuần…03…(Từ ngày…17/08/2026…đến ngày:… 21/08/2026….)</w:t>
       </w:r>
     </w:p>
@@ -5446,6 +6141,12 @@
                 <w:szCs w:val="26"/>
               </w:rPr>
             </w:pPr>
+            <w:r>
+              <w:rPr>
+                <w:rFonts w:ascii="Times New Roman" w:hAnsi="Times New Roman"/>
+                <w:sz w:val="26"/>
+              </w:rPr>
+            </w:r>
           </w:p>
         </w:tc>
         <w:tc>
@@ -5467,6 +6168,12 @@
                 <w:szCs w:val="26"/>
               </w:rPr>
             </w:pPr>
+            <w:r>
+              <w:rPr>
+                <w:rFonts w:ascii="Times New Roman" w:hAnsi="Times New Roman"/>
+                <w:sz w:val="26"/>
+              </w:rPr>
+            </w:r>
           </w:p>
         </w:tc>
         <w:tc>
@@ -5488,6 +6195,12 @@
                 <w:szCs w:val="26"/>
               </w:rPr>
             </w:pPr>
+            <w:r>
+              <w:rPr>
+                <w:rFonts w:ascii="Times New Roman" w:hAnsi="Times New Roman"/>
+                <w:sz w:val="26"/>
+              </w:rPr>
+            </w:r>
           </w:p>
         </w:tc>
         <w:tc>
@@ -5509,6 +6222,12 @@
                 <w:szCs w:val="26"/>
               </w:rPr>
             </w:pPr>
+            <w:r>
+              <w:rPr>
+                <w:rFonts w:ascii="Times New Roman" w:hAnsi="Times New Roman"/>
+                <w:sz w:val="26"/>
+              </w:rPr>
+            </w:r>
           </w:p>
         </w:tc>
         <w:tc>
@@ -5530,6 +6249,12 @@
                 <w:szCs w:val="26"/>
               </w:rPr>
             </w:pPr>
+            <w:r>
+              <w:rPr>
+                <w:rFonts w:ascii="Times New Roman" w:hAnsi="Times New Roman"/>
+                <w:sz w:val="26"/>
+              </w:rPr>
+            </w:r>
           </w:p>
         </w:tc>
       </w:tr>
@@ -5607,6 +6332,12 @@
                 <w:szCs w:val="26"/>
               </w:rPr>
             </w:pPr>
+            <w:r>
+              <w:rPr>
+                <w:rFonts w:ascii="Times New Roman" w:hAnsi="Times New Roman"/>
+                <w:sz w:val="26"/>
+              </w:rPr>
+            </w:r>
           </w:p>
         </w:tc>
         <w:tc>
@@ -5628,6 +6359,12 @@
                 <w:szCs w:val="26"/>
               </w:rPr>
             </w:pPr>
+            <w:r>
+              <w:rPr>
+                <w:rFonts w:ascii="Times New Roman" w:hAnsi="Times New Roman"/>
+                <w:sz w:val="26"/>
+              </w:rPr>
+            </w:r>
           </w:p>
         </w:tc>
         <w:tc>
@@ -5649,6 +6386,12 @@
                 <w:szCs w:val="26"/>
               </w:rPr>
             </w:pPr>
+            <w:r>
+              <w:rPr>
+                <w:rFonts w:ascii="Times New Roman" w:hAnsi="Times New Roman"/>
+                <w:sz w:val="26"/>
+              </w:rPr>
+            </w:r>
           </w:p>
         </w:tc>
         <w:tc>
@@ -5670,6 +6413,12 @@
                 <w:szCs w:val="26"/>
               </w:rPr>
             </w:pPr>
+            <w:r>
+              <w:rPr>
+                <w:rFonts w:ascii="Times New Roman" w:hAnsi="Times New Roman"/>
+                <w:sz w:val="26"/>
+              </w:rPr>
+            </w:r>
           </w:p>
         </w:tc>
         <w:tc>
@@ -5691,6 +6440,12 @@
                 <w:szCs w:val="26"/>
               </w:rPr>
             </w:pPr>
+            <w:r>
+              <w:rPr>
+                <w:rFonts w:ascii="Times New Roman" w:hAnsi="Times New Roman"/>
+                <w:sz w:val="26"/>
+              </w:rPr>
+            </w:r>
           </w:p>
         </w:tc>
       </w:tr>
@@ -5768,6 +6523,12 @@
                 <w:szCs w:val="26"/>
               </w:rPr>
             </w:pPr>
+            <w:r>
+              <w:rPr>
+                <w:rFonts w:ascii="Times New Roman" w:hAnsi="Times New Roman"/>
+                <w:sz w:val="26"/>
+              </w:rPr>
+            </w:r>
           </w:p>
         </w:tc>
         <w:tc>
@@ -5789,6 +6550,12 @@
                 <w:szCs w:val="26"/>
               </w:rPr>
             </w:pPr>
+            <w:r>
+              <w:rPr>
+                <w:rFonts w:ascii="Times New Roman" w:hAnsi="Times New Roman"/>
+                <w:sz w:val="26"/>
+              </w:rPr>
+            </w:r>
           </w:p>
         </w:tc>
         <w:tc>
@@ -5810,6 +6577,12 @@
                 <w:szCs w:val="26"/>
               </w:rPr>
             </w:pPr>
+            <w:r>
+              <w:rPr>
+                <w:rFonts w:ascii="Times New Roman" w:hAnsi="Times New Roman"/>
+                <w:sz w:val="26"/>
+              </w:rPr>
+            </w:r>
           </w:p>
         </w:tc>
         <w:tc>
@@ -5831,6 +6604,12 @@
                 <w:szCs w:val="26"/>
               </w:rPr>
             </w:pPr>
+            <w:r>
+              <w:rPr>
+                <w:rFonts w:ascii="Times New Roman" w:hAnsi="Times New Roman"/>
+                <w:sz w:val="26"/>
+              </w:rPr>
+            </w:r>
           </w:p>
         </w:tc>
         <w:tc>
@@ -5852,6 +6631,12 @@
                 <w:szCs w:val="26"/>
               </w:rPr>
             </w:pPr>
+            <w:r>
+              <w:rPr>
+                <w:rFonts w:ascii="Times New Roman" w:hAnsi="Times New Roman"/>
+                <w:sz w:val="26"/>
+              </w:rPr>
+            </w:r>
           </w:p>
         </w:tc>
       </w:tr>
@@ -5929,6 +6714,12 @@
                 <w:szCs w:val="26"/>
               </w:rPr>
             </w:pPr>
+            <w:r>
+              <w:rPr>
+                <w:rFonts w:ascii="Times New Roman" w:hAnsi="Times New Roman"/>
+                <w:sz w:val="26"/>
+              </w:rPr>
+            </w:r>
           </w:p>
         </w:tc>
         <w:tc>
@@ -5950,6 +6741,12 @@
                 <w:szCs w:val="26"/>
               </w:rPr>
             </w:pPr>
+            <w:r>
+              <w:rPr>
+                <w:rFonts w:ascii="Times New Roman" w:hAnsi="Times New Roman"/>
+                <w:sz w:val="26"/>
+              </w:rPr>
+            </w:r>
           </w:p>
         </w:tc>
         <w:tc>
@@ -5971,6 +6768,12 @@
                 <w:szCs w:val="26"/>
               </w:rPr>
             </w:pPr>
+            <w:r>
+              <w:rPr>
+                <w:rFonts w:ascii="Times New Roman" w:hAnsi="Times New Roman"/>
+                <w:sz w:val="26"/>
+              </w:rPr>
+            </w:r>
           </w:p>
         </w:tc>
         <w:tc>
@@ -5992,6 +6795,12 @@
                 <w:szCs w:val="26"/>
               </w:rPr>
             </w:pPr>
+            <w:r>
+              <w:rPr>
+                <w:rFonts w:ascii="Times New Roman" w:hAnsi="Times New Roman"/>
+                <w:sz w:val="26"/>
+              </w:rPr>
+            </w:r>
           </w:p>
         </w:tc>
         <w:tc>
@@ -6013,6 +6822,12 @@
                 <w:szCs w:val="26"/>
               </w:rPr>
             </w:pPr>
+            <w:r>
+              <w:rPr>
+                <w:rFonts w:ascii="Times New Roman" w:hAnsi="Times New Roman"/>
+                <w:sz w:val="26"/>
+              </w:rPr>
+            </w:r>
           </w:p>
         </w:tc>
       </w:tr>
@@ -6090,6 +6905,12 @@
                 <w:szCs w:val="26"/>
               </w:rPr>
             </w:pPr>
+            <w:r>
+              <w:rPr>
+                <w:rFonts w:ascii="Times New Roman" w:hAnsi="Times New Roman"/>
+                <w:sz w:val="26"/>
+              </w:rPr>
+            </w:r>
           </w:p>
         </w:tc>
         <w:tc>
@@ -6111,6 +6932,12 @@
                 <w:szCs w:val="26"/>
               </w:rPr>
             </w:pPr>
+            <w:r>
+              <w:rPr>
+                <w:rFonts w:ascii="Times New Roman" w:hAnsi="Times New Roman"/>
+                <w:sz w:val="26"/>
+              </w:rPr>
+            </w:r>
           </w:p>
         </w:tc>
         <w:tc>
@@ -6132,6 +6959,12 @@
                 <w:szCs w:val="26"/>
               </w:rPr>
             </w:pPr>
+            <w:r>
+              <w:rPr>
+                <w:rFonts w:ascii="Times New Roman" w:hAnsi="Times New Roman"/>
+                <w:sz w:val="26"/>
+              </w:rPr>
+            </w:r>
           </w:p>
         </w:tc>
         <w:tc>
@@ -6153,6 +6986,12 @@
                 <w:szCs w:val="26"/>
               </w:rPr>
             </w:pPr>
+            <w:r>
+              <w:rPr>
+                <w:rFonts w:ascii="Times New Roman" w:hAnsi="Times New Roman"/>
+                <w:sz w:val="26"/>
+              </w:rPr>
+            </w:r>
           </w:p>
         </w:tc>
         <w:tc>
@@ -6174,6 +7013,12 @@
                 <w:szCs w:val="26"/>
               </w:rPr>
             </w:pPr>
+            <w:r>
+              <w:rPr>
+                <w:rFonts w:ascii="Times New Roman" w:hAnsi="Times New Roman"/>
+                <w:sz w:val="26"/>
+              </w:rPr>
+            </w:r>
           </w:p>
         </w:tc>
       </w:tr>
@@ -6257,6 +7102,13 @@
                 <w:szCs w:val="26"/>
               </w:rPr>
             </w:pPr>
+            <w:r>
+              <w:rPr>
+                <w:rFonts w:ascii="Times New Roman" w:hAnsi="Times New Roman" w:cs="Times New Roman"/>
+                <w:sz w:val="26"/>
+                <w:szCs w:val="26"/>
+              </w:rPr>
+            </w:r>
           </w:p>
         </w:tc>
         <w:tc>
@@ -6278,6 +7130,13 @@
                 <w:szCs w:val="26"/>
               </w:rPr>
             </w:pPr>
+            <w:r>
+              <w:rPr>
+                <w:rFonts w:ascii="Times New Roman" w:hAnsi="Times New Roman" w:cs="Times New Roman"/>
+                <w:sz w:val="26"/>
+                <w:szCs w:val="26"/>
+              </w:rPr>
+            </w:r>
           </w:p>
         </w:tc>
         <w:tc>
@@ -6299,6 +7158,13 @@
                 <w:szCs w:val="26"/>
               </w:rPr>
             </w:pPr>
+            <w:r>
+              <w:rPr>
+                <w:rFonts w:ascii="Times New Roman" w:hAnsi="Times New Roman" w:cs="Times New Roman"/>
+                <w:sz w:val="26"/>
+                <w:szCs w:val="26"/>
+              </w:rPr>
+            </w:r>
           </w:p>
         </w:tc>
         <w:tc>
@@ -6320,6 +7186,13 @@
                 <w:szCs w:val="26"/>
               </w:rPr>
             </w:pPr>
+            <w:r>
+              <w:rPr>
+                <w:rFonts w:ascii="Times New Roman" w:hAnsi="Times New Roman" w:cs="Times New Roman"/>
+                <w:sz w:val="26"/>
+                <w:szCs w:val="26"/>
+              </w:rPr>
+            </w:r>
           </w:p>
         </w:tc>
         <w:tc>
@@ -6341,6 +7214,13 @@
                 <w:szCs w:val="26"/>
               </w:rPr>
             </w:pPr>
+            <w:r>
+              <w:rPr>
+                <w:rFonts w:ascii="Times New Roman" w:hAnsi="Times New Roman" w:cs="Times New Roman"/>
+                <w:sz w:val="26"/>
+                <w:szCs w:val="26"/>
+              </w:rPr>
+            </w:r>
           </w:p>
         </w:tc>
       </w:tr>
@@ -6420,6 +7300,13 @@
                 <w:szCs w:val="26"/>
               </w:rPr>
             </w:pPr>
+            <w:r>
+              <w:rPr>
+                <w:rFonts w:ascii="Times New Roman" w:hAnsi="Times New Roman" w:cs="Times New Roman"/>
+                <w:sz w:val="26"/>
+                <w:szCs w:val="26"/>
+              </w:rPr>
+            </w:r>
           </w:p>
         </w:tc>
         <w:tc>
@@ -6441,6 +7328,13 @@
                 <w:szCs w:val="26"/>
               </w:rPr>
             </w:pPr>
+            <w:r>
+              <w:rPr>
+                <w:rFonts w:ascii="Times New Roman" w:hAnsi="Times New Roman" w:cs="Times New Roman"/>
+                <w:sz w:val="26"/>
+                <w:szCs w:val="26"/>
+              </w:rPr>
+            </w:r>
           </w:p>
         </w:tc>
         <w:tc>
@@ -6462,6 +7356,13 @@
                 <w:szCs w:val="26"/>
               </w:rPr>
             </w:pPr>
+            <w:r>
+              <w:rPr>
+                <w:rFonts w:ascii="Times New Roman" w:hAnsi="Times New Roman" w:cs="Times New Roman"/>
+                <w:sz w:val="26"/>
+                <w:szCs w:val="26"/>
+              </w:rPr>
+            </w:r>
           </w:p>
         </w:tc>
         <w:tc>
@@ -6483,6 +7384,13 @@
                 <w:szCs w:val="26"/>
               </w:rPr>
             </w:pPr>
+            <w:r>
+              <w:rPr>
+                <w:rFonts w:ascii="Times New Roman" w:hAnsi="Times New Roman" w:cs="Times New Roman"/>
+                <w:sz w:val="26"/>
+                <w:szCs w:val="26"/>
+              </w:rPr>
+            </w:r>
           </w:p>
         </w:tc>
         <w:tc>
@@ -6504,6 +7412,13 @@
                 <w:szCs w:val="26"/>
               </w:rPr>
             </w:pPr>
+            <w:r>
+              <w:rPr>
+                <w:rFonts w:ascii="Times New Roman" w:hAnsi="Times New Roman" w:cs="Times New Roman"/>
+                <w:sz w:val="26"/>
+                <w:szCs w:val="26"/>
+              </w:rPr>
+            </w:r>
           </w:p>
         </w:tc>
       </w:tr>
@@ -6989,6 +7904,12 @@
                 <w:szCs w:val="26"/>
               </w:rPr>
             </w:pPr>
+            <w:r>
+              <w:rPr>
+                <w:rFonts w:ascii="Times New Roman" w:hAnsi="Times New Roman"/>
+                <w:sz w:val="26"/>
+              </w:rPr>
+            </w:r>
           </w:p>
         </w:tc>
         <w:tc>
@@ -7010,6 +7931,12 @@
                 <w:szCs w:val="26"/>
               </w:rPr>
             </w:pPr>
+            <w:r>
+              <w:rPr>
+                <w:rFonts w:ascii="Times New Roman" w:hAnsi="Times New Roman"/>
+                <w:sz w:val="26"/>
+              </w:rPr>
+            </w:r>
           </w:p>
         </w:tc>
         <w:tc>
@@ -7031,6 +7958,12 @@
                 <w:szCs w:val="26"/>
               </w:rPr>
             </w:pPr>
+            <w:r>
+              <w:rPr>
+                <w:rFonts w:ascii="Times New Roman" w:hAnsi="Times New Roman"/>
+                <w:sz w:val="26"/>
+              </w:rPr>
+            </w:r>
           </w:p>
         </w:tc>
         <w:tc>
@@ -7052,6 +7985,12 @@
                 <w:szCs w:val="26"/>
               </w:rPr>
             </w:pPr>
+            <w:r>
+              <w:rPr>
+                <w:rFonts w:ascii="Times New Roman" w:hAnsi="Times New Roman"/>
+                <w:sz w:val="26"/>
+              </w:rPr>
+            </w:r>
           </w:p>
         </w:tc>
         <w:tc>
@@ -7073,6 +8012,12 @@
                 <w:szCs w:val="26"/>
               </w:rPr>
             </w:pPr>
+            <w:r>
+              <w:rPr>
+                <w:rFonts w:ascii="Times New Roman" w:hAnsi="Times New Roman"/>
+                <w:sz w:val="26"/>
+              </w:rPr>
+            </w:r>
           </w:p>
         </w:tc>
       </w:tr>
@@ -7156,6 +8101,12 @@
                 <w:szCs w:val="26"/>
               </w:rPr>
             </w:pPr>
+            <w:r>
+              <w:rPr>
+                <w:rFonts w:ascii="Times New Roman" w:hAnsi="Times New Roman"/>
+                <w:sz w:val="26"/>
+              </w:rPr>
+            </w:r>
           </w:p>
         </w:tc>
         <w:tc>
@@ -7177,6 +8128,12 @@
                 <w:szCs w:val="26"/>
               </w:rPr>
             </w:pPr>
+            <w:r>
+              <w:rPr>
+                <w:rFonts w:ascii="Times New Roman" w:hAnsi="Times New Roman"/>
+                <w:sz w:val="26"/>
+              </w:rPr>
+            </w:r>
           </w:p>
         </w:tc>
         <w:tc>
@@ -7198,6 +8155,12 @@
                 <w:szCs w:val="26"/>
               </w:rPr>
             </w:pPr>
+            <w:r>
+              <w:rPr>
+                <w:rFonts w:ascii="Times New Roman" w:hAnsi="Times New Roman"/>
+                <w:sz w:val="26"/>
+              </w:rPr>
+            </w:r>
           </w:p>
         </w:tc>
         <w:tc>
@@ -7219,6 +8182,12 @@
                 <w:szCs w:val="26"/>
               </w:rPr>
             </w:pPr>
+            <w:r>
+              <w:rPr>
+                <w:rFonts w:ascii="Times New Roman" w:hAnsi="Times New Roman"/>
+                <w:sz w:val="26"/>
+              </w:rPr>
+            </w:r>
           </w:p>
         </w:tc>
         <w:tc>
@@ -7240,6 +8209,12 @@
                 <w:szCs w:val="26"/>
               </w:rPr>
             </w:pPr>
+            <w:r>
+              <w:rPr>
+                <w:rFonts w:ascii="Times New Roman" w:hAnsi="Times New Roman"/>
+                <w:sz w:val="26"/>
+              </w:rPr>
+            </w:r>
           </w:p>
         </w:tc>
       </w:tr>
@@ -7319,6 +8294,12 @@
                 <w:szCs w:val="26"/>
               </w:rPr>
             </w:pPr>
+            <w:r>
+              <w:rPr>
+                <w:rFonts w:ascii="Times New Roman" w:hAnsi="Times New Roman"/>
+                <w:sz w:val="26"/>
+              </w:rPr>
+            </w:r>
           </w:p>
         </w:tc>
         <w:tc>
@@ -7340,6 +8321,12 @@
                 <w:szCs w:val="26"/>
               </w:rPr>
             </w:pPr>
+            <w:r>
+              <w:rPr>
+                <w:rFonts w:ascii="Times New Roman" w:hAnsi="Times New Roman"/>
+                <w:sz w:val="26"/>
+              </w:rPr>
+            </w:r>
           </w:p>
         </w:tc>
         <w:tc>
@@ -7361,6 +8348,12 @@
                 <w:szCs w:val="26"/>
               </w:rPr>
             </w:pPr>
+            <w:r>
+              <w:rPr>
+                <w:rFonts w:ascii="Times New Roman" w:hAnsi="Times New Roman"/>
+                <w:sz w:val="26"/>
+              </w:rPr>
+            </w:r>
           </w:p>
         </w:tc>
         <w:tc>
@@ -7382,6 +8375,12 @@
                 <w:szCs w:val="26"/>
               </w:rPr>
             </w:pPr>
+            <w:r>
+              <w:rPr>
+                <w:rFonts w:ascii="Times New Roman" w:hAnsi="Times New Roman"/>
+                <w:sz w:val="26"/>
+              </w:rPr>
+            </w:r>
           </w:p>
         </w:tc>
         <w:tc>
@@ -7403,6 +8402,12 @@
                 <w:szCs w:val="26"/>
               </w:rPr>
             </w:pPr>
+            <w:r>
+              <w:rPr>
+                <w:rFonts w:ascii="Times New Roman" w:hAnsi="Times New Roman"/>
+                <w:sz w:val="26"/>
+              </w:rPr>
+            </w:r>
           </w:p>
         </w:tc>
       </w:tr>
@@ -7482,6 +8487,13 @@
                 <w:szCs w:val="26"/>
               </w:rPr>
             </w:pPr>
+            <w:r>
+              <w:rPr>
+                <w:rFonts w:ascii="Times New Roman" w:hAnsi="Times New Roman" w:cs="Times New Roman"/>
+                <w:sz w:val="26"/>
+                <w:szCs w:val="26"/>
+              </w:rPr>
+            </w:r>
           </w:p>
         </w:tc>
         <w:tc>
@@ -7503,6 +8515,13 @@
                 <w:szCs w:val="26"/>
               </w:rPr>
             </w:pPr>
+            <w:r>
+              <w:rPr>
+                <w:rFonts w:ascii="Times New Roman" w:hAnsi="Times New Roman" w:cs="Times New Roman"/>
+                <w:sz w:val="26"/>
+                <w:szCs w:val="26"/>
+              </w:rPr>
+            </w:r>
           </w:p>
         </w:tc>
         <w:tc>
@@ -7524,6 +8543,13 @@
                 <w:szCs w:val="26"/>
               </w:rPr>
             </w:pPr>
+            <w:r>
+              <w:rPr>
+                <w:rFonts w:ascii="Times New Roman" w:hAnsi="Times New Roman" w:cs="Times New Roman"/>
+                <w:sz w:val="26"/>
+                <w:szCs w:val="26"/>
+              </w:rPr>
+            </w:r>
           </w:p>
         </w:tc>
         <w:tc>
@@ -7545,6 +8571,13 @@
                 <w:szCs w:val="26"/>
               </w:rPr>
             </w:pPr>
+            <w:r>
+              <w:rPr>
+                <w:rFonts w:ascii="Times New Roman" w:hAnsi="Times New Roman" w:cs="Times New Roman"/>
+                <w:sz w:val="26"/>
+                <w:szCs w:val="26"/>
+              </w:rPr>
+            </w:r>
           </w:p>
         </w:tc>
         <w:tc>
@@ -7566,6 +8599,13 @@
                 <w:szCs w:val="26"/>
               </w:rPr>
             </w:pPr>
+            <w:r>
+              <w:rPr>
+                <w:rFonts w:ascii="Times New Roman" w:hAnsi="Times New Roman" w:cs="Times New Roman"/>
+                <w:sz w:val="26"/>
+                <w:szCs w:val="26"/>
+              </w:rPr>
+            </w:r>
           </w:p>
         </w:tc>
       </w:tr>
@@ -7645,6 +8685,13 @@
                 <w:szCs w:val="26"/>
               </w:rPr>
             </w:pPr>
+            <w:r>
+              <w:rPr>
+                <w:rFonts w:ascii="Times New Roman" w:hAnsi="Times New Roman" w:cs="Times New Roman"/>
+                <w:sz w:val="26"/>
+                <w:szCs w:val="26"/>
+              </w:rPr>
+            </w:r>
           </w:p>
         </w:tc>
         <w:tc>
@@ -7666,6 +8713,13 @@
                 <w:szCs w:val="26"/>
               </w:rPr>
             </w:pPr>
+            <w:r>
+              <w:rPr>
+                <w:rFonts w:ascii="Times New Roman" w:hAnsi="Times New Roman" w:cs="Times New Roman"/>
+                <w:sz w:val="26"/>
+                <w:szCs w:val="26"/>
+              </w:rPr>
+            </w:r>
           </w:p>
         </w:tc>
         <w:tc>
@@ -7687,6 +8741,13 @@
                 <w:szCs w:val="26"/>
               </w:rPr>
             </w:pPr>
+            <w:r>
+              <w:rPr>
+                <w:rFonts w:ascii="Times New Roman" w:hAnsi="Times New Roman" w:cs="Times New Roman"/>
+                <w:sz w:val="26"/>
+                <w:szCs w:val="26"/>
+              </w:rPr>
+            </w:r>
           </w:p>
         </w:tc>
         <w:tc>
@@ -7708,6 +8769,13 @@
                 <w:szCs w:val="26"/>
               </w:rPr>
             </w:pPr>
+            <w:r>
+              <w:rPr>
+                <w:rFonts w:ascii="Times New Roman" w:hAnsi="Times New Roman" w:cs="Times New Roman"/>
+                <w:sz w:val="26"/>
+                <w:szCs w:val="26"/>
+              </w:rPr>
+            </w:r>
           </w:p>
         </w:tc>
         <w:tc>
@@ -7729,6 +8797,13 @@
                 <w:szCs w:val="26"/>
               </w:rPr>
             </w:pPr>
+            <w:r>
+              <w:rPr>
+                <w:rFonts w:ascii="Times New Roman" w:hAnsi="Times New Roman" w:cs="Times New Roman"/>
+                <w:sz w:val="26"/>
+                <w:szCs w:val="26"/>
+              </w:rPr>
+            </w:r>
           </w:p>
         </w:tc>
       </w:tr>
@@ -7808,6 +8883,12 @@
                 <w:szCs w:val="26"/>
               </w:rPr>
             </w:pPr>
+            <w:r>
+              <w:rPr>
+                <w:rFonts w:ascii="Times New Roman" w:hAnsi="Times New Roman"/>
+                <w:sz w:val="26"/>
+              </w:rPr>
+            </w:r>
           </w:p>
         </w:tc>
         <w:tc>
@@ -7829,6 +8910,12 @@
                 <w:szCs w:val="26"/>
               </w:rPr>
             </w:pPr>
+            <w:r>
+              <w:rPr>
+                <w:rFonts w:ascii="Times New Roman" w:hAnsi="Times New Roman"/>
+                <w:sz w:val="26"/>
+              </w:rPr>
+            </w:r>
           </w:p>
         </w:tc>
         <w:tc>
@@ -7850,6 +8937,12 @@
                 <w:szCs w:val="26"/>
               </w:rPr>
             </w:pPr>
+            <w:r>
+              <w:rPr>
+                <w:rFonts w:ascii="Times New Roman" w:hAnsi="Times New Roman"/>
+                <w:sz w:val="26"/>
+              </w:rPr>
+            </w:r>
           </w:p>
         </w:tc>
         <w:tc>
@@ -7871,6 +8964,12 @@
                 <w:szCs w:val="26"/>
               </w:rPr>
             </w:pPr>
+            <w:r>
+              <w:rPr>
+                <w:rFonts w:ascii="Times New Roman" w:hAnsi="Times New Roman"/>
+                <w:sz w:val="26"/>
+              </w:rPr>
+            </w:r>
           </w:p>
         </w:tc>
         <w:tc>
@@ -7892,6 +8991,12 @@
                 <w:szCs w:val="26"/>
               </w:rPr>
             </w:pPr>
+            <w:r>
+              <w:rPr>
+                <w:rFonts w:ascii="Times New Roman" w:hAnsi="Times New Roman"/>
+                <w:sz w:val="26"/>
+              </w:rPr>
+            </w:r>
           </w:p>
         </w:tc>
       </w:tr>
@@ -7975,6 +9080,13 @@
                 <w:szCs w:val="26"/>
               </w:rPr>
             </w:pPr>
+            <w:r>
+              <w:rPr>
+                <w:rFonts w:ascii="Times New Roman" w:hAnsi="Times New Roman" w:cs="Times New Roman"/>
+                <w:sz w:val="26"/>
+                <w:szCs w:val="26"/>
+              </w:rPr>
+            </w:r>
           </w:p>
         </w:tc>
         <w:tc>
@@ -7996,6 +9108,13 @@
                 <w:szCs w:val="26"/>
               </w:rPr>
             </w:pPr>
+            <w:r>
+              <w:rPr>
+                <w:rFonts w:ascii="Times New Roman" w:hAnsi="Times New Roman" w:cs="Times New Roman"/>
+                <w:sz w:val="26"/>
+                <w:szCs w:val="26"/>
+              </w:rPr>
+            </w:r>
           </w:p>
         </w:tc>
         <w:tc>
@@ -8017,6 +9136,13 @@
                 <w:szCs w:val="26"/>
               </w:rPr>
             </w:pPr>
+            <w:r>
+              <w:rPr>
+                <w:rFonts w:ascii="Times New Roman" w:hAnsi="Times New Roman" w:cs="Times New Roman"/>
+                <w:sz w:val="26"/>
+                <w:szCs w:val="26"/>
+              </w:rPr>
+            </w:r>
           </w:p>
         </w:tc>
         <w:tc>
@@ -8038,6 +9164,13 @@
                 <w:szCs w:val="26"/>
               </w:rPr>
             </w:pPr>
+            <w:r>
+              <w:rPr>
+                <w:rFonts w:ascii="Times New Roman" w:hAnsi="Times New Roman" w:cs="Times New Roman"/>
+                <w:sz w:val="26"/>
+                <w:szCs w:val="26"/>
+              </w:rPr>
+            </w:r>
           </w:p>
         </w:tc>
         <w:tc>
@@ -8059,6 +9192,13 @@
                 <w:szCs w:val="26"/>
               </w:rPr>
             </w:pPr>
+            <w:r>
+              <w:rPr>
+                <w:rFonts w:ascii="Times New Roman" w:hAnsi="Times New Roman" w:cs="Times New Roman"/>
+                <w:sz w:val="26"/>
+                <w:szCs w:val="26"/>
+              </w:rPr>
+            </w:r>
           </w:p>
         </w:tc>
       </w:tr>
@@ -8138,6 +9278,13 @@
                 <w:szCs w:val="26"/>
               </w:rPr>
             </w:pPr>
+            <w:r>
+              <w:rPr>
+                <w:rFonts w:ascii="Times New Roman" w:hAnsi="Times New Roman" w:cs="Times New Roman"/>
+                <w:sz w:val="26"/>
+                <w:szCs w:val="26"/>
+              </w:rPr>
+            </w:r>
           </w:p>
         </w:tc>
         <w:tc>
@@ -8159,6 +9306,13 @@
                 <w:szCs w:val="26"/>
               </w:rPr>
             </w:pPr>
+            <w:r>
+              <w:rPr>
+                <w:rFonts w:ascii="Times New Roman" w:hAnsi="Times New Roman" w:cs="Times New Roman"/>
+                <w:sz w:val="26"/>
+                <w:szCs w:val="26"/>
+              </w:rPr>
+            </w:r>
           </w:p>
         </w:tc>
         <w:tc>
@@ -8180,6 +9334,13 @@
                 <w:szCs w:val="26"/>
               </w:rPr>
             </w:pPr>
+            <w:r>
+              <w:rPr>
+                <w:rFonts w:ascii="Times New Roman" w:hAnsi="Times New Roman" w:cs="Times New Roman"/>
+                <w:sz w:val="26"/>
+                <w:szCs w:val="26"/>
+              </w:rPr>
+            </w:r>
           </w:p>
         </w:tc>
         <w:tc>
@@ -8201,6 +9362,13 @@
                 <w:szCs w:val="26"/>
               </w:rPr>
             </w:pPr>
+            <w:r>
+              <w:rPr>
+                <w:rFonts w:ascii="Times New Roman" w:hAnsi="Times New Roman" w:cs="Times New Roman"/>
+                <w:sz w:val="26"/>
+                <w:szCs w:val="26"/>
+              </w:rPr>
+            </w:r>
           </w:p>
         </w:tc>
         <w:tc>
@@ -8222,6 +9390,13 @@
                 <w:szCs w:val="26"/>
               </w:rPr>
             </w:pPr>
+            <w:r>
+              <w:rPr>
+                <w:rFonts w:ascii="Times New Roman" w:hAnsi="Times New Roman" w:cs="Times New Roman"/>
+                <w:sz w:val="26"/>
+                <w:szCs w:val="26"/>
+              </w:rPr>
+            </w:r>
           </w:p>
         </w:tc>
       </w:tr>
@@ -8301,6 +9476,13 @@
                 <w:szCs w:val="26"/>
               </w:rPr>
             </w:pPr>
+            <w:r>
+              <w:rPr>
+                <w:rFonts w:ascii="Times New Roman" w:hAnsi="Times New Roman" w:cs="Times New Roman"/>
+                <w:sz w:val="26"/>
+                <w:szCs w:val="26"/>
+              </w:rPr>
+            </w:r>
           </w:p>
         </w:tc>
         <w:tc>
@@ -8322,6 +9504,13 @@
                 <w:szCs w:val="26"/>
               </w:rPr>
             </w:pPr>
+            <w:r>
+              <w:rPr>
+                <w:rFonts w:ascii="Times New Roman" w:hAnsi="Times New Roman" w:cs="Times New Roman"/>
+                <w:sz w:val="26"/>
+                <w:szCs w:val="26"/>
+              </w:rPr>
+            </w:r>
           </w:p>
         </w:tc>
         <w:tc>
@@ -8343,6 +9532,13 @@
                 <w:szCs w:val="26"/>
               </w:rPr>
             </w:pPr>
+            <w:r>
+              <w:rPr>
+                <w:rFonts w:ascii="Times New Roman" w:hAnsi="Times New Roman" w:cs="Times New Roman"/>
+                <w:sz w:val="26"/>
+                <w:szCs w:val="26"/>
+              </w:rPr>
+            </w:r>
           </w:p>
         </w:tc>
         <w:tc>
@@ -8364,6 +9560,13 @@
                 <w:szCs w:val="26"/>
               </w:rPr>
             </w:pPr>
+            <w:r>
+              <w:rPr>
+                <w:rFonts w:ascii="Times New Roman" w:hAnsi="Times New Roman" w:cs="Times New Roman"/>
+                <w:sz w:val="26"/>
+                <w:szCs w:val="26"/>
+              </w:rPr>
+            </w:r>
           </w:p>
         </w:tc>
         <w:tc>
@@ -8385,6 +9588,13 @@
                 <w:szCs w:val="26"/>
               </w:rPr>
             </w:pPr>
+            <w:r>
+              <w:rPr>
+                <w:rFonts w:ascii="Times New Roman" w:hAnsi="Times New Roman" w:cs="Times New Roman"/>
+                <w:sz w:val="26"/>
+                <w:szCs w:val="26"/>
+              </w:rPr>
+            </w:r>
           </w:p>
         </w:tc>
       </w:tr>
@@ -8464,6 +9674,13 @@
                 <w:szCs w:val="26"/>
               </w:rPr>
             </w:pPr>
+            <w:r>
+              <w:rPr>
+                <w:rFonts w:ascii="Times New Roman" w:hAnsi="Times New Roman" w:cs="Times New Roman"/>
+                <w:sz w:val="26"/>
+                <w:szCs w:val="26"/>
+              </w:rPr>
+            </w:r>
           </w:p>
         </w:tc>
         <w:tc>
@@ -8485,6 +9702,13 @@
                 <w:szCs w:val="26"/>
               </w:rPr>
             </w:pPr>
+            <w:r>
+              <w:rPr>
+                <w:rFonts w:ascii="Times New Roman" w:hAnsi="Times New Roman" w:cs="Times New Roman"/>
+                <w:sz w:val="26"/>
+                <w:szCs w:val="26"/>
+              </w:rPr>
+            </w:r>
           </w:p>
         </w:tc>
         <w:tc>
@@ -8506,6 +9730,13 @@
                 <w:szCs w:val="26"/>
               </w:rPr>
             </w:pPr>
+            <w:r>
+              <w:rPr>
+                <w:rFonts w:ascii="Times New Roman" w:hAnsi="Times New Roman" w:cs="Times New Roman"/>
+                <w:sz w:val="26"/>
+                <w:szCs w:val="26"/>
+              </w:rPr>
+            </w:r>
           </w:p>
         </w:tc>
         <w:tc>
@@ -8527,6 +9758,13 @@
                 <w:szCs w:val="26"/>
               </w:rPr>
             </w:pPr>
+            <w:r>
+              <w:rPr>
+                <w:rFonts w:ascii="Times New Roman" w:hAnsi="Times New Roman" w:cs="Times New Roman"/>
+                <w:sz w:val="26"/>
+                <w:szCs w:val="26"/>
+              </w:rPr>
+            </w:r>
           </w:p>
         </w:tc>
         <w:tc>
@@ -8548,6 +9786,13 @@
                 <w:szCs w:val="26"/>
               </w:rPr>
             </w:pPr>
+            <w:r>
+              <w:rPr>
+                <w:rFonts w:ascii="Times New Roman" w:hAnsi="Times New Roman" w:cs="Times New Roman"/>
+                <w:sz w:val="26"/>
+                <w:szCs w:val="26"/>
+              </w:rPr>
+            </w:r>
           </w:p>
         </w:tc>
       </w:tr>
@@ -8627,6 +9872,12 @@
                 <w:szCs w:val="26"/>
               </w:rPr>
             </w:pPr>
+            <w:r>
+              <w:rPr>
+                <w:rFonts w:ascii="Times New Roman" w:hAnsi="Times New Roman"/>
+                <w:sz w:val="26"/>
+              </w:rPr>
+            </w:r>
           </w:p>
         </w:tc>
         <w:tc>
@@ -8648,6 +9899,12 @@
                 <w:szCs w:val="26"/>
               </w:rPr>
             </w:pPr>
+            <w:r>
+              <w:rPr>
+                <w:rFonts w:ascii="Times New Roman" w:hAnsi="Times New Roman"/>
+                <w:sz w:val="26"/>
+              </w:rPr>
+            </w:r>
           </w:p>
         </w:tc>
         <w:tc>
@@ -8669,6 +9926,12 @@
                 <w:szCs w:val="26"/>
               </w:rPr>
             </w:pPr>
+            <w:r>
+              <w:rPr>
+                <w:rFonts w:ascii="Times New Roman" w:hAnsi="Times New Roman"/>
+                <w:sz w:val="26"/>
+              </w:rPr>
+            </w:r>
           </w:p>
         </w:tc>
         <w:tc>
@@ -8690,6 +9953,12 @@
                 <w:szCs w:val="26"/>
               </w:rPr>
             </w:pPr>
+            <w:r>
+              <w:rPr>
+                <w:rFonts w:ascii="Times New Roman" w:hAnsi="Times New Roman"/>
+                <w:sz w:val="26"/>
+              </w:rPr>
+            </w:r>
           </w:p>
         </w:tc>
         <w:tc>
@@ -8711,6 +9980,12 @@
                 <w:szCs w:val="26"/>
               </w:rPr>
             </w:pPr>
+            <w:r>
+              <w:rPr>
+                <w:rFonts w:ascii="Times New Roman" w:hAnsi="Times New Roman"/>
+                <w:sz w:val="26"/>
+              </w:rPr>
+            </w:r>
           </w:p>
         </w:tc>
       </w:tr>
@@ -9194,6 +10469,13 @@
                 <w:szCs w:val="26"/>
               </w:rPr>
             </w:pPr>
+            <w:r>
+              <w:rPr>
+                <w:rFonts w:ascii="Times New Roman" w:hAnsi="Times New Roman" w:cs="Times New Roman"/>
+                <w:sz w:val="26"/>
+                <w:szCs w:val="26"/>
+              </w:rPr>
+            </w:r>
           </w:p>
         </w:tc>
         <w:tc>
@@ -9215,6 +10497,13 @@
                 <w:szCs w:val="26"/>
               </w:rPr>
             </w:pPr>
+            <w:r>
+              <w:rPr>
+                <w:rFonts w:ascii="Times New Roman" w:hAnsi="Times New Roman" w:cs="Times New Roman"/>
+                <w:sz w:val="26"/>
+                <w:szCs w:val="26"/>
+              </w:rPr>
+            </w:r>
           </w:p>
         </w:tc>
         <w:tc>
@@ -9236,6 +10525,13 @@
                 <w:szCs w:val="26"/>
               </w:rPr>
             </w:pPr>
+            <w:r>
+              <w:rPr>
+                <w:rFonts w:ascii="Times New Roman" w:hAnsi="Times New Roman" w:cs="Times New Roman"/>
+                <w:sz w:val="26"/>
+                <w:szCs w:val="26"/>
+              </w:rPr>
+            </w:r>
           </w:p>
         </w:tc>
         <w:tc>
@@ -9257,6 +10553,13 @@
                 <w:szCs w:val="26"/>
               </w:rPr>
             </w:pPr>
+            <w:r>
+              <w:rPr>
+                <w:rFonts w:ascii="Times New Roman" w:hAnsi="Times New Roman" w:cs="Times New Roman"/>
+                <w:sz w:val="26"/>
+                <w:szCs w:val="26"/>
+              </w:rPr>
+            </w:r>
           </w:p>
         </w:tc>
         <w:tc>
@@ -9278,6 +10581,13 @@
                 <w:szCs w:val="26"/>
               </w:rPr>
             </w:pPr>
+            <w:r>
+              <w:rPr>
+                <w:rFonts w:ascii="Times New Roman" w:hAnsi="Times New Roman" w:cs="Times New Roman"/>
+                <w:sz w:val="26"/>
+                <w:szCs w:val="26"/>
+              </w:rPr>
+            </w:r>
           </w:p>
         </w:tc>
       </w:tr>
@@ -9354,6 +10664,12 @@
                 <w:szCs w:val="26"/>
               </w:rPr>
             </w:pPr>
+            <w:r>
+              <w:rPr>
+                <w:rFonts w:ascii="Times New Roman" w:hAnsi="Times New Roman"/>
+                <w:sz w:val="26"/>
+              </w:rPr>
+            </w:r>
           </w:p>
         </w:tc>
         <w:tc>
@@ -9375,6 +10691,12 @@
                 <w:szCs w:val="26"/>
               </w:rPr>
             </w:pPr>
+            <w:r>
+              <w:rPr>
+                <w:rFonts w:ascii="Times New Roman" w:hAnsi="Times New Roman"/>
+                <w:sz w:val="26"/>
+              </w:rPr>
+            </w:r>
           </w:p>
         </w:tc>
         <w:tc>
@@ -9396,6 +10718,12 @@
                 <w:szCs w:val="26"/>
               </w:rPr>
             </w:pPr>
+            <w:r>
+              <w:rPr>
+                <w:rFonts w:ascii="Times New Roman" w:hAnsi="Times New Roman"/>
+                <w:sz w:val="26"/>
+              </w:rPr>
+            </w:r>
           </w:p>
         </w:tc>
         <w:tc>
@@ -9417,6 +10745,12 @@
                 <w:szCs w:val="26"/>
               </w:rPr>
             </w:pPr>
+            <w:r>
+              <w:rPr>
+                <w:rFonts w:ascii="Times New Roman" w:hAnsi="Times New Roman"/>
+                <w:sz w:val="26"/>
+              </w:rPr>
+            </w:r>
           </w:p>
         </w:tc>
         <w:tc>
@@ -9438,6 +10772,12 @@
                 <w:szCs w:val="26"/>
               </w:rPr>
             </w:pPr>
+            <w:r>
+              <w:rPr>
+                <w:rFonts w:ascii="Times New Roman" w:hAnsi="Times New Roman"/>
+                <w:sz w:val="26"/>
+              </w:rPr>
+            </w:r>
           </w:p>
         </w:tc>
       </w:tr>
@@ -9514,6 +10854,12 @@
                 <w:szCs w:val="26"/>
               </w:rPr>
             </w:pPr>
+            <w:r>
+              <w:rPr>
+                <w:rFonts w:ascii="Times New Roman" w:hAnsi="Times New Roman"/>
+                <w:sz w:val="26"/>
+              </w:rPr>
+            </w:r>
           </w:p>
         </w:tc>
         <w:tc>
@@ -9535,6 +10881,12 @@
                 <w:szCs w:val="26"/>
               </w:rPr>
             </w:pPr>
+            <w:r>
+              <w:rPr>
+                <w:rFonts w:ascii="Times New Roman" w:hAnsi="Times New Roman"/>
+                <w:sz w:val="26"/>
+              </w:rPr>
+            </w:r>
           </w:p>
         </w:tc>
         <w:tc>
@@ -9556,6 +10908,12 @@
                 <w:szCs w:val="26"/>
               </w:rPr>
             </w:pPr>
+            <w:r>
+              <w:rPr>
+                <w:rFonts w:ascii="Times New Roman" w:hAnsi="Times New Roman"/>
+                <w:sz w:val="26"/>
+              </w:rPr>
+            </w:r>
           </w:p>
         </w:tc>
         <w:tc>
@@ -9577,6 +10935,12 @@
                 <w:szCs w:val="26"/>
               </w:rPr>
             </w:pPr>
+            <w:r>
+              <w:rPr>
+                <w:rFonts w:ascii="Times New Roman" w:hAnsi="Times New Roman"/>
+                <w:sz w:val="26"/>
+              </w:rPr>
+            </w:r>
           </w:p>
         </w:tc>
         <w:tc>
@@ -9598,6 +10962,12 @@
                 <w:szCs w:val="26"/>
               </w:rPr>
             </w:pPr>
+            <w:r>
+              <w:rPr>
+                <w:rFonts w:ascii="Times New Roman" w:hAnsi="Times New Roman"/>
+                <w:sz w:val="26"/>
+              </w:rPr>
+            </w:r>
           </w:p>
         </w:tc>
       </w:tr>
@@ -9761,80 +11131,6 @@
               <w:t>(Ký tên, đóng dấu)</w:t>
             </w:r>
           </w:p>
-          <w:p>
-            <w:pPr>
-              <w:jc w:val="center"/>
-              <w:rPr>
-                <w:rFonts w:ascii="Times New Roman" w:hAnsi="Times New Roman" w:cs="Times New Roman"/>
-                <w:sz w:val="26"/>
-                <w:szCs w:val="26"/>
-              </w:rPr>
-            </w:pPr>
-          </w:p>
-          <w:p>
-            <w:pPr>
-              <w:jc w:val="center"/>
-              <w:rPr>
-                <w:rFonts w:ascii="Times New Roman" w:hAnsi="Times New Roman" w:cs="Times New Roman"/>
-                <w:sz w:val="26"/>
-                <w:szCs w:val="26"/>
-              </w:rPr>
-            </w:pPr>
-          </w:p>
-          <w:p>
-            <w:pPr>
-              <w:jc w:val="center"/>
-              <w:rPr>
-                <w:rFonts w:ascii="Times New Roman" w:hAnsi="Times New Roman" w:cs="Times New Roman"/>
-                <w:sz w:val="26"/>
-                <w:szCs w:val="26"/>
-              </w:rPr>
-            </w:pPr>
-          </w:p>
-          <w:p>
-            <w:pPr>
-              <w:jc w:val="center"/>
-              <w:rPr>
-                <w:rFonts w:ascii="Times New Roman" w:hAnsi="Times New Roman" w:cs="Times New Roman"/>
-                <w:sz w:val="26"/>
-                <w:szCs w:val="26"/>
-              </w:rPr>
-            </w:pPr>
-          </w:p>
-          <w:p>
-            <w:pPr>
-              <w:jc w:val="center"/>
-              <w:rPr>
-                <w:rFonts w:ascii="Times New Roman" w:hAnsi="Times New Roman" w:cs="Times New Roman"/>
-                <w:sz w:val="26"/>
-                <w:szCs w:val="26"/>
-              </w:rPr>
-            </w:pPr>
-            <w:r>
-              <w:rPr>
-                <w:rFonts w:ascii="Times New Roman" w:hAnsi="Times New Roman" w:cs="Times New Roman"/>
-                <w:sz w:val="26"/>
-                <w:szCs w:val="26"/>
-              </w:rPr>
-              <w:t>Nguyễn</w:t>
-            </w:r>
-            <w:r>
-              <w:rPr>
-                <w:rFonts w:ascii="Times New Roman" w:hAnsi="Times New Roman" w:cs="Times New Roman"/>
-                <w:sz w:val="26"/>
-                <w:szCs w:val="26"/>
-              </w:rPr>
-              <w:t xml:space="preserve"> Thị</w:t>
-            </w:r>
-            <w:r>
-              <w:rPr>
-                <w:rFonts w:ascii="Times New Roman" w:hAnsi="Times New Roman" w:cs="Times New Roman"/>
-                <w:sz w:val="26"/>
-                <w:szCs w:val="26"/>
-              </w:rPr>
-              <w:t xml:space="preserve"> Ngọc Ánh</w:t>
-            </w:r>
-          </w:p>
         </w:tc>
       </w:tr>
     </w:tbl>
@@ -9861,7 +11157,6 @@
           <w:color w:val="000000"/>
           <w:szCs w:val="28"/>
         </w:rPr>
-        <w:lastRenderedPageBreak/>
         <w:t>Nhận xét của BGH hoặc tổ trưởng chuyên môn về tiến độ thực hiện chương trình</w:t>
       </w:r>
     </w:p>

</xml_diff>

<commit_message>
Cap nhat KHBD Tin hoc, bo sung Slide Tuan 03-04 & tai lieu CV 3456
</commit_message>
<xml_diff>
--- a/Hệ thống mẫu văn bản/Nguyên đã làm/Lịch báo giảng/Lịch báo giảng - Tuần 03 (THCS).docx
+++ b/Hệ thống mẫu văn bản/Nguyên đã làm/Lịch báo giảng/Lịch báo giảng - Tuần 03 (THCS).docx
@@ -5754,6 +5754,8 @@
               </w:rPr>
               <w:br/>
               <w:t>Tổ trưởng</w:t>
+              <w:br/>
+              <w:t>Nguyễn Thị Ngọc Ánh</w:t>
             </w:r>
             <w:r>
               <w:rPr>
@@ -11068,26 +11070,20 @@
                 <w:sz w:val="26"/>
                 <w:szCs w:val="26"/>
               </w:rPr>
-              <w:br/>
-              <w:t>…………………………………………………………………</w:t>
-            </w:r>
-            <w:r>
-              <w:rPr>
-                <w:rFonts w:ascii="Times New Roman" w:hAnsi="Times New Roman" w:cs="Times New Roman"/>
-                <w:sz w:val="26"/>
-                <w:szCs w:val="26"/>
-              </w:rPr>
-              <w:br/>
-              <w:t>…………………………………………………………………</w:t>
-            </w:r>
-            <w:r>
-              <w:rPr>
-                <w:rFonts w:ascii="Times New Roman" w:hAnsi="Times New Roman" w:cs="Times New Roman"/>
-                <w:sz w:val="26"/>
-                <w:szCs w:val="26"/>
-              </w:rPr>
-              <w:br/>
-              <w:t>…………………………………………………………………</w:t>
+            </w:r>
+            <w:r>
+              <w:rPr>
+                <w:rFonts w:ascii="Times New Roman" w:hAnsi="Times New Roman" w:cs="Times New Roman"/>
+                <w:sz w:val="26"/>
+                <w:szCs w:val="26"/>
+              </w:rPr>
+            </w:r>
+            <w:r>
+              <w:rPr>
+                <w:rFonts w:ascii="Times New Roman" w:hAnsi="Times New Roman" w:cs="Times New Roman"/>
+                <w:sz w:val="26"/>
+                <w:szCs w:val="26"/>
+              </w:rPr>
             </w:r>
           </w:p>
         </w:tc>
@@ -11120,6 +11116,8 @@
               </w:rPr>
               <w:br/>
               <w:t>Tổ trưởng</w:t>
+              <w:br/>
+              <w:t>Nguyễn Thị Ngọc Ánh</w:t>
             </w:r>
             <w:r>
               <w:rPr>

</xml_diff>